<commit_message>
Añadido 1.2 y Actualizado la fase 2
</commit_message>
<xml_diff>
--- a/docs/fase2-desarrollo/grupales/2.4_GuiaEstudiante_Fase 2_DesarrolloProyecto APT.docx
+++ b/docs/fase2-desarrollo/grupales/2.4_GuiaEstudiante_Fase 2_DesarrolloProyecto APT.docx
@@ -1,11 +1,8 @@
 
 <file path=word/document.xml><?xml version="1.0" encoding="utf-8"?>
-<w:document xmlns:wpc="http://schemas.microsoft.com/office/word/2010/wordprocessingCanvas" xmlns:cx="http://schemas.microsoft.com/office/drawing/2014/chartex" xmlns:mc="http://schemas.openxmlformats.org/markup-compatibility/2006" xmlns:o="urn:schemas-microsoft-com:office:office" xmlns:r="http://schemas.openxmlformats.org/officeDocument/2006/relationships" xmlns:m="http://schemas.openxmlformats.org/officeDocument/2006/math" xmlns:v="urn:schemas-microsoft-com:vml" xmlns:wp14="http://schemas.microsoft.com/office/word/2010/wordprocessingDrawing" xmlns:wp="http://schemas.openxmlformats.org/drawingml/2006/wordprocessingDrawing" xmlns:w10="urn:schemas-microsoft-com:office:word" xmlns:w="http://schemas.openxmlformats.org/wordprocessingml/2006/main" xmlns:w14="http://schemas.microsoft.com/office/word/2010/wordml" xmlns:w15="http://schemas.microsoft.com/office/word/2012/wordml" xmlns:w16se="http://schemas.microsoft.com/office/word/2015/wordml/symex" xmlns:wpg="http://schemas.microsoft.com/office/word/2010/wordprocessingGroup" xmlns:wpi="http://schemas.microsoft.com/office/word/2010/wordprocessingInk" xmlns:wne="http://schemas.microsoft.com/office/word/2006/wordml" xmlns:wps="http://schemas.microsoft.com/office/word/2010/wordprocessingShape" mc:Ignorable="w14 w15 w16se wp14">
+<w:document xmlns:wpc="http://schemas.microsoft.com/office/word/2010/wordprocessingCanvas" xmlns:cx="http://schemas.microsoft.com/office/drawing/2014/chartex" xmlns:cx1="http://schemas.microsoft.com/office/drawing/2015/9/8/chartex" xmlns:cx2="http://schemas.microsoft.com/office/drawing/2015/10/21/chartex" xmlns:cx3="http://schemas.microsoft.com/office/drawing/2016/5/9/chartex" xmlns:cx4="http://schemas.microsoft.com/office/drawing/2016/5/10/chartex" xmlns:cx5="http://schemas.microsoft.com/office/drawing/2016/5/11/chartex" xmlns:cx6="http://schemas.microsoft.com/office/drawing/2016/5/12/chartex" xmlns:cx7="http://schemas.microsoft.com/office/drawing/2016/5/13/chartex" xmlns:cx8="http://schemas.microsoft.com/office/drawing/2016/5/14/chartex" xmlns:mc="http://schemas.openxmlformats.org/markup-compatibility/2006" xmlns:aink="http://schemas.microsoft.com/office/drawing/2016/ink" xmlns:am3d="http://schemas.microsoft.com/office/drawing/2017/model3d" xmlns:o="urn:schemas-microsoft-com:office:office" xmlns:oel="http://schemas.microsoft.com/office/2019/extlst" xmlns:r="http://schemas.openxmlformats.org/officeDocument/2006/relationships" xmlns:m="http://schemas.openxmlformats.org/officeDocument/2006/math" xmlns:v="urn:schemas-microsoft-com:vml" xmlns:wp14="http://schemas.microsoft.com/office/word/2010/wordprocessingDrawing" xmlns:wp="http://schemas.openxmlformats.org/drawingml/2006/wordprocessingDrawing" xmlns:w10="urn:schemas-microsoft-com:office:word" xmlns:w="http://schemas.openxmlformats.org/wordprocessingml/2006/main" xmlns:w14="http://schemas.microsoft.com/office/word/2010/wordml" xmlns:w15="http://schemas.microsoft.com/office/word/2012/wordml" xmlns:w16cex="http://schemas.microsoft.com/office/word/2018/wordml/cex" xmlns:w16cid="http://schemas.microsoft.com/office/word/2016/wordml/cid" xmlns:w16="http://schemas.microsoft.com/office/word/2018/wordml" xmlns:w16du="http://schemas.microsoft.com/office/word/2023/wordml/word16du" xmlns:w16sdtdh="http://schemas.microsoft.com/office/word/2020/wordml/sdtdatahash" xmlns:w16sdtfl="http://schemas.microsoft.com/office/word/2024/wordml/sdtformatlock" xmlns:w16se="http://schemas.microsoft.com/office/word/2015/wordml/symex" xmlns:wpg="http://schemas.microsoft.com/office/word/2010/wordprocessingGroup" xmlns:wpi="http://schemas.microsoft.com/office/word/2010/wordprocessingInk" xmlns:wne="http://schemas.microsoft.com/office/word/2006/wordml" xmlns:wps="http://schemas.microsoft.com/office/word/2010/wordprocessingShape" mc:Ignorable="w14 w15 w16se w16cid w16 w16cex w16sdtdh w16sdtfl w16du wp14">
   <w:body>
-    <w:p>
-      <w:bookmarkStart w:id="0" w:name="_GoBack"/>
-      <w:bookmarkEnd w:id="0"/>
-    </w:p>
+    <w:p/>
     <w:p>
       <w:pPr>
         <w:rPr>
@@ -165,6 +162,7 @@
                                 </w:rPr>
                                 <w:t xml:space="preserve">Asignatura </w:t>
                               </w:r>
+                              <w:proofErr w:type="spellStart"/>
                               <w:r>
                                 <w:rPr>
                                   <w:b/>
@@ -174,6 +172,7 @@
                                 </w:rPr>
                                 <w:t>Capstone</w:t>
                               </w:r>
+                              <w:proofErr w:type="spellEnd"/>
                             </w:p>
                           </w:txbxContent>
                         </wps:txbx>
@@ -238,7 +237,7 @@
           </mc:Choice>
           <mc:Fallback>
             <w:pict>
-              <v:group w14:anchorId="39581AEC" id="Grupo 27" o:spid="_x0000_s1026" style="position:absolute;margin-left:0;margin-top:.75pt;width:491.25pt;height:123pt;z-index:251659264;mso-position-horizontal:center;mso-position-horizontal-relative:margin;mso-width-relative:margin;mso-height-relative:margin" coordsize="59912,15621" o:gfxdata="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">
+              <v:group w14:anchorId="39581AEC" id="Grupo 27" o:spid="_x0000_s1026" style="position:absolute;margin-left:0;margin-top:.75pt;width:491.25pt;height:123pt;z-index:251659264;mso-position-horizontal:center;mso-position-horizontal-relative:margin;mso-width-relative:margin;mso-height-relative:margin" coordsize="59912,15621" o:gfxdata="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">
                 <v:shapetype id="_x0000_t202" coordsize="21600,21600" o:spt="202" path="m,l,21600r21600,l21600,xe">
                   <v:stroke joinstyle="miter"/>
                   <v:path gradientshapeok="t" o:connecttype="rect"/>
@@ -341,6 +340,7 @@
                           </w:rPr>
                           <w:t xml:space="preserve">Asignatura </w:t>
                         </w:r>
+                        <w:proofErr w:type="spellStart"/>
                         <w:r>
                           <w:rPr>
                             <w:b/>
@@ -350,6 +350,7 @@
                           </w:rPr>
                           <w:t>Capstone</w:t>
                         </w:r>
+                        <w:proofErr w:type="spellEnd"/>
                       </w:p>
                     </w:txbxContent>
                   </v:textbox>
@@ -630,164 +631,30 @@
               <w:jc w:val="both"/>
               <w:rPr>
                 <w:rFonts w:ascii="Calibri" w:hAnsi="Calibri" w:cs="Arial"/>
-                <w:i/>
-                <w:color w:val="548DD4"/>
-                <w:sz w:val="20"/>
-                <w:szCs w:val="20"/>
-                <w:lang w:eastAsia="es-CL"/>
-              </w:rPr>
-            </w:pPr>
-            <w:r>
-              <w:rPr>
-                <w:rFonts w:ascii="Calibri" w:hAnsi="Calibri" w:cs="Arial"/>
-                <w:i/>
-                <w:color w:val="548DD4"/>
-                <w:sz w:val="20"/>
-                <w:szCs w:val="20"/>
-                <w:lang w:eastAsia="es-CL"/>
-              </w:rPr>
-              <w:t xml:space="preserve">En esta </w:t>
-            </w:r>
-            <w:r>
-              <w:rPr>
-                <w:rFonts w:ascii="Calibri" w:hAnsi="Calibri" w:cs="Arial"/>
-                <w:i/>
-                <w:color w:val="548DD4"/>
-                <w:sz w:val="20"/>
-                <w:szCs w:val="20"/>
-                <w:lang w:eastAsia="es-CL"/>
-              </w:rPr>
-              <w:t>sección</w:t>
-            </w:r>
-            <w:r>
-              <w:rPr>
-                <w:rFonts w:ascii="Calibri" w:hAnsi="Calibri" w:cs="Arial"/>
-                <w:i/>
-                <w:color w:val="548DD4"/>
-                <w:sz w:val="20"/>
-                <w:szCs w:val="20"/>
-                <w:lang w:eastAsia="es-CL"/>
-              </w:rPr>
-              <w:t xml:space="preserve"> deberá</w:t>
-            </w:r>
-            <w:r>
-              <w:rPr>
-                <w:rFonts w:ascii="Calibri" w:hAnsi="Calibri" w:cs="Arial"/>
-                <w:i/>
-                <w:color w:val="548DD4"/>
-                <w:sz w:val="20"/>
-                <w:szCs w:val="20"/>
-                <w:lang w:eastAsia="es-CL"/>
-              </w:rPr>
-              <w:t>s</w:t>
-            </w:r>
-            <w:r>
-              <w:rPr>
-                <w:rFonts w:ascii="Calibri" w:hAnsi="Calibri" w:cs="Arial"/>
-                <w:i/>
-                <w:color w:val="548DD4"/>
-                <w:sz w:val="20"/>
-                <w:szCs w:val="20"/>
-                <w:lang w:eastAsia="es-CL"/>
-              </w:rPr>
-              <w:t xml:space="preserve"> </w:t>
-            </w:r>
-            <w:r>
-              <w:rPr>
-                <w:rFonts w:ascii="Calibri" w:hAnsi="Calibri" w:cs="Arial"/>
-                <w:i/>
-                <w:color w:val="548DD4"/>
-                <w:sz w:val="20"/>
-                <w:szCs w:val="20"/>
-                <w:lang w:eastAsia="es-CL"/>
-              </w:rPr>
-              <w:t xml:space="preserve">realizar un resumen de los avances que has realizado en tu proyecto APT. </w:t>
-            </w:r>
-            <w:r>
-              <w:rPr>
-                <w:rFonts w:ascii="Calibri" w:hAnsi="Calibri" w:cs="Arial"/>
-                <w:i/>
-                <w:color w:val="548DD4"/>
-                <w:sz w:val="20"/>
-                <w:szCs w:val="20"/>
-                <w:lang w:eastAsia="es-CL"/>
-              </w:rPr>
-              <w:t xml:space="preserve">Relata </w:t>
-            </w:r>
-            <w:r>
-              <w:rPr>
-                <w:rFonts w:ascii="Calibri" w:hAnsi="Calibri" w:cs="Arial"/>
-                <w:i/>
-                <w:color w:val="548DD4"/>
-                <w:sz w:val="20"/>
-                <w:szCs w:val="20"/>
-                <w:lang w:eastAsia="es-CL"/>
-              </w:rPr>
-              <w:t xml:space="preserve">brevemente </w:t>
-            </w:r>
-            <w:r>
-              <w:rPr>
-                <w:rFonts w:ascii="Calibri" w:hAnsi="Calibri" w:cs="Arial"/>
-                <w:i/>
-                <w:color w:val="548DD4"/>
-                <w:sz w:val="20"/>
-                <w:szCs w:val="20"/>
-                <w:lang w:eastAsia="es-CL"/>
-              </w:rPr>
-              <w:t xml:space="preserve">qué </w:t>
-            </w:r>
-            <w:r>
-              <w:rPr>
-                <w:rFonts w:ascii="Calibri" w:hAnsi="Calibri" w:cs="Arial"/>
-                <w:i/>
-                <w:color w:val="548DD4"/>
-                <w:sz w:val="20"/>
-                <w:szCs w:val="20"/>
-                <w:lang w:eastAsia="es-CL"/>
-              </w:rPr>
-              <w:t xml:space="preserve">actividades </w:t>
-            </w:r>
-            <w:r>
-              <w:rPr>
-                <w:rFonts w:ascii="Calibri" w:hAnsi="Calibri" w:cs="Arial"/>
-                <w:i/>
-                <w:color w:val="548DD4"/>
-                <w:sz w:val="20"/>
-                <w:szCs w:val="20"/>
-                <w:lang w:eastAsia="es-CL"/>
-              </w:rPr>
-              <w:t>del proyecto has llevado a cabo y qué objetivos específicos has cumplido hasta el minuto y de qué manera.</w:t>
-            </w:r>
-          </w:p>
-          <w:p>
-            <w:pPr>
-              <w:jc w:val="both"/>
-              <w:rPr>
-                <w:rFonts w:ascii="Calibri" w:hAnsi="Calibri" w:cs="Arial"/>
-                <w:i/>
-                <w:color w:val="548DD4"/>
-                <w:sz w:val="20"/>
-                <w:szCs w:val="20"/>
-                <w:lang w:eastAsia="es-CL"/>
-              </w:rPr>
-            </w:pPr>
-            <w:r>
-              <w:rPr>
-                <w:rFonts w:ascii="Calibri" w:hAnsi="Calibri" w:cs="Arial"/>
-                <w:i/>
-                <w:color w:val="548DD4"/>
-                <w:sz w:val="20"/>
-                <w:szCs w:val="20"/>
-                <w:lang w:eastAsia="es-CL"/>
-              </w:rPr>
-              <w:t>En caso que hayas realizado ajustes a los objetivos o metodología, debes incluir dichos apartados nuevamente en este informe, señalando cuáles son dichos ajustes.</w:t>
+                <w:iCs/>
+                <w:color w:val="548DD4"/>
+                <w:sz w:val="20"/>
+                <w:szCs w:val="20"/>
+                <w:lang w:val="es-ES" w:eastAsia="es-CL"/>
+              </w:rPr>
+            </w:pPr>
+            <w:r>
+              <w:rPr>
+                <w:rFonts w:ascii="Calibri" w:hAnsi="Calibri" w:cs="Arial"/>
+                <w:iCs/>
+                <w:color w:val="548DD4"/>
+                <w:sz w:val="20"/>
+                <w:szCs w:val="20"/>
+                <w:lang w:val="es-ES" w:eastAsia="es-CL"/>
+              </w:rPr>
+              <w:t>Se ha completado la fase de diseño de la arquitectura de software y especificación de requerimientos del Sistema Integrado de Captura Digital y Gestión de Prospectos para Admisión para el Departamento de Admisión y Difusión de Duoc UC Sede Valparaíso.</w:t>
             </w:r>
           </w:p>
         </w:tc>
       </w:tr>
       <w:tr>
         <w:trPr>
-          <w:trHeight w:val="1247"/>
+          <w:trHeight w:val="905"/>
         </w:trPr>
         <w:tc>
           <w:tcPr>
@@ -820,24 +687,219 @@
               <w:jc w:val="both"/>
               <w:rPr>
                 <w:rFonts w:ascii="Calibri" w:hAnsi="Calibri" w:cs="Arial"/>
+                <w:iCs/>
+                <w:color w:val="548DD4"/>
+                <w:sz w:val="20"/>
+                <w:szCs w:val="20"/>
+                <w:lang w:val="es-ES" w:eastAsia="es-CL"/>
+              </w:rPr>
+            </w:pPr>
+            <w:r>
+              <w:rPr>
+                <w:rFonts w:ascii="Calibri" w:hAnsi="Calibri" w:cs="Arial"/>
                 <w:b/>
+                <w:bCs/>
+                <w:iCs/>
+                <w:color w:val="548DD4"/>
+                <w:sz w:val="20"/>
+                <w:szCs w:val="20"/>
+                <w:lang w:val="es-ES" w:eastAsia="es-CL"/>
+              </w:rPr>
+              <w:t>Objetivo General</w:t>
+            </w:r>
+            <w:r>
+              <w:rPr>
+                <w:rFonts w:ascii="Calibri" w:hAnsi="Calibri" w:cs="Arial"/>
+                <w:iCs/>
+                <w:color w:val="548DD4"/>
+                <w:sz w:val="20"/>
+                <w:szCs w:val="20"/>
+                <w:lang w:val="es-ES" w:eastAsia="es-CL"/>
+              </w:rPr>
+              <w:t>:</w:t>
+            </w:r>
+            <w:r>
+              <w:rPr>
+                <w:rFonts w:ascii="Calibri" w:hAnsi="Calibri" w:cs="Arial"/>
+                <w:iCs/>
+                <w:color w:val="548DD4"/>
+                <w:sz w:val="20"/>
+                <w:szCs w:val="20"/>
+                <w:lang w:val="es-ES" w:eastAsia="es-CL"/>
+              </w:rPr>
+              <w:t xml:space="preserve"> </w:t>
+            </w:r>
+          </w:p>
+          <w:p>
+            <w:pPr>
+              <w:jc w:val="both"/>
+              <w:rPr>
+                <w:rFonts w:ascii="Calibri" w:hAnsi="Calibri" w:cs="Arial"/>
+                <w:iCs/>
+                <w:color w:val="548DD4"/>
+                <w:sz w:val="20"/>
+                <w:szCs w:val="20"/>
+                <w:lang w:val="es-ES" w:eastAsia="es-CL"/>
+              </w:rPr>
+            </w:pPr>
+            <w:r>
+              <w:rPr>
+                <w:rFonts w:ascii="Calibri" w:hAnsi="Calibri" w:cs="Arial"/>
+                <w:iCs/>
+                <w:color w:val="548DD4"/>
+                <w:sz w:val="20"/>
+                <w:szCs w:val="20"/>
+                <w:lang w:val="es-ES" w:eastAsia="es-CL"/>
+              </w:rPr>
+              <w:t>Implementar un sistema web progresivo (PWA) de captura digital y sincronización offline para agilizar el registro de postulantes en ferias vocacionales.</w:t>
+            </w:r>
+          </w:p>
+          <w:p>
+            <w:pPr>
+              <w:jc w:val="both"/>
+              <w:rPr>
+                <w:rFonts w:ascii="Calibri" w:hAnsi="Calibri" w:cs="Arial"/>
+                <w:b/>
+                <w:bCs/>
+                <w:iCs/>
+                <w:color w:val="548DD4"/>
+                <w:sz w:val="20"/>
+                <w:szCs w:val="20"/>
+                <w:lang w:val="es-ES" w:eastAsia="es-CL"/>
+              </w:rPr>
+            </w:pPr>
+            <w:r>
+              <w:rPr>
+                <w:rFonts w:ascii="Calibri" w:hAnsi="Calibri" w:cs="Arial"/>
+                <w:b/>
+                <w:bCs/>
+                <w:iCs/>
+                <w:color w:val="548DD4"/>
+                <w:sz w:val="20"/>
+                <w:szCs w:val="20"/>
+                <w:lang w:val="es-ES" w:eastAsia="es-CL"/>
+              </w:rPr>
+              <w:t>Objetivos Específicos:</w:t>
+            </w:r>
+          </w:p>
+          <w:p>
+            <w:pPr>
+              <w:jc w:val="both"/>
+              <w:rPr>
+                <w:rFonts w:ascii="Calibri" w:hAnsi="Calibri" w:cs="Arial"/>
+                <w:iCs/>
+                <w:color w:val="548DD4"/>
+                <w:sz w:val="20"/>
+                <w:szCs w:val="20"/>
+                <w:lang w:val="es-ES" w:eastAsia="es-CL"/>
+              </w:rPr>
+            </w:pPr>
+            <w:r>
+              <w:rPr>
+                <w:rFonts w:ascii="Calibri" w:hAnsi="Calibri" w:cs="Arial"/>
+                <w:iCs/>
+                <w:color w:val="548DD4"/>
+                <w:sz w:val="20"/>
+                <w:szCs w:val="20"/>
+                <w:lang w:val="es-ES" w:eastAsia="es-CL"/>
+              </w:rPr>
+              <w:t>Desarrollar un módulo de escaneo y decodificación de cédulas de identidad (PDF417/MRZ) mediante la cámara del dispositivo móvil.</w:t>
+            </w:r>
+          </w:p>
+          <w:p>
+            <w:pPr>
+              <w:jc w:val="both"/>
+              <w:rPr>
+                <w:rFonts w:ascii="Calibri" w:hAnsi="Calibri" w:cs="Arial"/>
+                <w:iCs/>
+                <w:color w:val="548DD4"/>
+                <w:sz w:val="20"/>
+                <w:szCs w:val="20"/>
+                <w:lang w:val="es-ES" w:eastAsia="es-CL"/>
+              </w:rPr>
+            </w:pPr>
+            <w:r>
+              <w:rPr>
+                <w:rFonts w:ascii="Calibri" w:hAnsi="Calibri" w:cs="Arial"/>
+                <w:iCs/>
+                <w:color w:val="548DD4"/>
+                <w:sz w:val="20"/>
+                <w:szCs w:val="20"/>
+                <w:lang w:val="es-ES" w:eastAsia="es-CL"/>
+              </w:rPr>
+              <w:t>Implementar almacenamiento local persistente (</w:t>
+            </w:r>
+            <w:r>
+              <w:rPr>
+                <w:rFonts w:ascii="Calibri" w:hAnsi="Calibri" w:cs="Arial"/>
                 <w:i/>
-                <w:color w:val="548DD4"/>
-                <w:sz w:val="20"/>
-                <w:szCs w:val="20"/>
-                <w:lang w:eastAsia="es-CL"/>
-              </w:rPr>
-            </w:pPr>
-            <w:r>
-              <w:rPr>
-                <w:rFonts w:ascii="Calibri" w:hAnsi="Calibri" w:cs="Arial"/>
-                <w:i/>
-                <w:color w:val="548DD4"/>
-                <w:sz w:val="20"/>
-                <w:szCs w:val="20"/>
-                <w:lang w:eastAsia="es-CL"/>
-              </w:rPr>
-              <w:t>Opcional en caso de ajuste</w:t>
+                <w:iCs/>
+                <w:color w:val="548DD4"/>
+                <w:sz w:val="20"/>
+                <w:szCs w:val="20"/>
+                <w:lang w:val="es-ES" w:eastAsia="es-CL"/>
+              </w:rPr>
+              <w:t>Offline-First</w:t>
+            </w:r>
+            <w:r>
+              <w:rPr>
+                <w:rFonts w:ascii="Calibri" w:hAnsi="Calibri" w:cs="Arial"/>
+                <w:iCs/>
+                <w:color w:val="548DD4"/>
+                <w:sz w:val="20"/>
+                <w:szCs w:val="20"/>
+                <w:lang w:val="es-ES" w:eastAsia="es-CL"/>
+              </w:rPr>
+              <w:t xml:space="preserve">) con </w:t>
+            </w:r>
+            <w:proofErr w:type="spellStart"/>
+            <w:r>
+              <w:rPr>
+                <w:rFonts w:ascii="Calibri" w:hAnsi="Calibri" w:cs="Arial"/>
+                <w:iCs/>
+                <w:color w:val="548DD4"/>
+                <w:sz w:val="20"/>
+                <w:szCs w:val="20"/>
+                <w:lang w:val="es-ES" w:eastAsia="es-CL"/>
+              </w:rPr>
+              <w:t>IndexedDB</w:t>
+            </w:r>
+            <w:proofErr w:type="spellEnd"/>
+            <w:r>
+              <w:rPr>
+                <w:rFonts w:ascii="Calibri" w:hAnsi="Calibri" w:cs="Arial"/>
+                <w:iCs/>
+                <w:color w:val="548DD4"/>
+                <w:sz w:val="20"/>
+                <w:szCs w:val="20"/>
+                <w:lang w:val="es-ES" w:eastAsia="es-CL"/>
+              </w:rPr>
+              <w:t xml:space="preserve"> y sincronización automática en segundo plano hacia una base de datos central PostgreSQL.</w:t>
+            </w:r>
+          </w:p>
+          <w:p>
+            <w:pPr>
+              <w:jc w:val="both"/>
+              <w:rPr>
+                <w:rFonts w:ascii="Calibri" w:hAnsi="Calibri" w:cs="Arial"/>
+                <w:b/>
+                <w:iCs/>
+                <w:color w:val="548DD4"/>
+                <w:sz w:val="20"/>
+                <w:szCs w:val="20"/>
+                <w:lang w:val="es-ES" w:eastAsia="es-CL"/>
+              </w:rPr>
+            </w:pPr>
+            <w:r>
+              <w:rPr>
+                <w:rFonts w:ascii="Calibri" w:hAnsi="Calibri" w:cs="Arial"/>
+                <w:iCs/>
+                <w:color w:val="548DD4"/>
+                <w:sz w:val="20"/>
+                <w:szCs w:val="20"/>
+                <w:lang w:val="es-ES" w:eastAsia="es-CL"/>
+              </w:rPr>
+              <w:t>Construir un panel de control con métricas en tiempo real para el monitoreo de afluencia y tiempos de registro durante los eventos.</w:t>
             </w:r>
           </w:p>
         </w:tc>
@@ -877,30 +939,30 @@
               <w:jc w:val="both"/>
               <w:rPr>
                 <w:rFonts w:ascii="Calibri" w:hAnsi="Calibri" w:cs="Arial"/>
-                <w:i/>
-                <w:color w:val="548DD4"/>
-                <w:sz w:val="20"/>
-                <w:szCs w:val="20"/>
-                <w:lang w:eastAsia="es-CL"/>
-              </w:rPr>
-            </w:pPr>
-            <w:r>
-              <w:rPr>
-                <w:rFonts w:ascii="Calibri" w:hAnsi="Calibri" w:cs="Arial"/>
-                <w:i/>
-                <w:color w:val="548DD4"/>
-                <w:sz w:val="20"/>
-                <w:szCs w:val="20"/>
-                <w:lang w:eastAsia="es-CL"/>
-              </w:rPr>
-              <w:t>Opcional en caso de ajuste</w:t>
+                <w:iCs/>
+                <w:color w:val="548DD4"/>
+                <w:sz w:val="20"/>
+                <w:szCs w:val="20"/>
+                <w:lang w:eastAsia="es-CL"/>
+              </w:rPr>
+            </w:pPr>
+            <w:r>
+              <w:rPr>
+                <w:rFonts w:ascii="Calibri" w:hAnsi="Calibri" w:cs="Arial"/>
+                <w:iCs/>
+                <w:color w:val="548DD4"/>
+                <w:sz w:val="20"/>
+                <w:szCs w:val="20"/>
+                <w:lang w:eastAsia="es-CL"/>
+              </w:rPr>
+              <w:t>Se emplea una metodología de desarrollo ágil adaptada a iteraciones cortas, apoyada por herramientas de control de versiones y un entorno de desarrollo estructurado con Node.js y bases de datos relacionales.</w:t>
             </w:r>
           </w:p>
         </w:tc>
       </w:tr>
       <w:tr>
         <w:trPr>
-          <w:trHeight w:val="2377"/>
+          <w:trHeight w:val="1314"/>
         </w:trPr>
         <w:tc>
           <w:tcPr>
@@ -933,369 +995,115 @@
               <w:jc w:val="both"/>
               <w:rPr>
                 <w:rFonts w:ascii="Calibri" w:hAnsi="Calibri" w:cs="Arial"/>
-                <w:i/>
-                <w:color w:val="548DD4"/>
-                <w:sz w:val="20"/>
-                <w:szCs w:val="20"/>
-                <w:lang w:eastAsia="es-CL"/>
-              </w:rPr>
-            </w:pPr>
-            <w:r>
-              <w:rPr>
-                <w:rFonts w:ascii="Calibri" w:hAnsi="Calibri" w:cs="Arial"/>
-                <w:i/>
-                <w:color w:val="548DD4"/>
-                <w:sz w:val="20"/>
-                <w:szCs w:val="20"/>
-                <w:lang w:eastAsia="es-CL"/>
-              </w:rPr>
-              <w:t>Describe la</w:t>
-            </w:r>
-            <w:r>
-              <w:rPr>
-                <w:rFonts w:ascii="Calibri" w:hAnsi="Calibri" w:cs="Arial"/>
-                <w:i/>
-                <w:color w:val="548DD4"/>
-                <w:sz w:val="20"/>
-                <w:szCs w:val="20"/>
-                <w:lang w:eastAsia="es-CL"/>
-              </w:rPr>
-              <w:t>(</w:t>
-            </w:r>
-            <w:r>
-              <w:rPr>
-                <w:rFonts w:ascii="Calibri" w:hAnsi="Calibri" w:cs="Arial"/>
-                <w:i/>
-                <w:color w:val="548DD4"/>
-                <w:sz w:val="20"/>
-                <w:szCs w:val="20"/>
-                <w:lang w:eastAsia="es-CL"/>
-              </w:rPr>
-              <w:t>s</w:t>
-            </w:r>
-            <w:r>
-              <w:rPr>
-                <w:rFonts w:ascii="Calibri" w:hAnsi="Calibri" w:cs="Arial"/>
-                <w:i/>
-                <w:color w:val="548DD4"/>
-                <w:sz w:val="20"/>
-                <w:szCs w:val="20"/>
-                <w:lang w:eastAsia="es-CL"/>
-              </w:rPr>
-              <w:t>)</w:t>
-            </w:r>
-            <w:r>
-              <w:rPr>
-                <w:rFonts w:ascii="Calibri" w:hAnsi="Calibri" w:cs="Arial"/>
-                <w:i/>
-                <w:color w:val="548DD4"/>
-                <w:sz w:val="20"/>
-                <w:szCs w:val="20"/>
-                <w:lang w:eastAsia="es-CL"/>
-              </w:rPr>
-              <w:t xml:space="preserve"> evidencia</w:t>
-            </w:r>
-            <w:r>
-              <w:rPr>
-                <w:rFonts w:ascii="Calibri" w:hAnsi="Calibri" w:cs="Arial"/>
-                <w:i/>
-                <w:color w:val="548DD4"/>
-                <w:sz w:val="20"/>
-                <w:szCs w:val="20"/>
-                <w:lang w:eastAsia="es-CL"/>
-              </w:rPr>
-              <w:t>(</w:t>
-            </w:r>
-            <w:r>
-              <w:rPr>
-                <w:rFonts w:ascii="Calibri" w:hAnsi="Calibri" w:cs="Arial"/>
-                <w:i/>
-                <w:color w:val="548DD4"/>
-                <w:sz w:val="20"/>
-                <w:szCs w:val="20"/>
-                <w:lang w:eastAsia="es-CL"/>
-              </w:rPr>
-              <w:t>s</w:t>
-            </w:r>
-            <w:r>
-              <w:rPr>
-                <w:rFonts w:ascii="Calibri" w:hAnsi="Calibri" w:cs="Arial"/>
-                <w:i/>
-                <w:color w:val="548DD4"/>
-                <w:sz w:val="20"/>
-                <w:szCs w:val="20"/>
-                <w:lang w:eastAsia="es-CL"/>
-              </w:rPr>
-              <w:t>)</w:t>
-            </w:r>
-            <w:r>
-              <w:rPr>
-                <w:rFonts w:ascii="Calibri" w:hAnsi="Calibri" w:cs="Arial"/>
-                <w:i/>
-                <w:color w:val="548DD4"/>
-                <w:sz w:val="20"/>
-                <w:szCs w:val="20"/>
-                <w:lang w:eastAsia="es-CL"/>
-              </w:rPr>
-              <w:t xml:space="preserve"> que </w:t>
-            </w:r>
-            <w:r>
-              <w:rPr>
-                <w:rFonts w:ascii="Calibri" w:hAnsi="Calibri" w:cs="Arial"/>
-                <w:i/>
-                <w:color w:val="548DD4"/>
-                <w:sz w:val="20"/>
-                <w:szCs w:val="20"/>
-                <w:lang w:eastAsia="es-CL"/>
-              </w:rPr>
-              <w:t xml:space="preserve">presentarás en este informe de avance y justifica </w:t>
-            </w:r>
-            <w:r>
-              <w:rPr>
-                <w:rFonts w:ascii="Calibri" w:hAnsi="Calibri" w:cs="Arial"/>
-                <w:i/>
-                <w:color w:val="548DD4"/>
-                <w:sz w:val="20"/>
-                <w:szCs w:val="20"/>
-                <w:lang w:eastAsia="es-CL"/>
-              </w:rPr>
-              <w:t xml:space="preserve">de qué manera </w:t>
-            </w:r>
-            <w:r>
-              <w:rPr>
-                <w:rFonts w:ascii="Calibri" w:hAnsi="Calibri" w:cs="Arial"/>
-                <w:i/>
-                <w:color w:val="548DD4"/>
-                <w:sz w:val="20"/>
-                <w:szCs w:val="20"/>
-                <w:lang w:eastAsia="es-CL"/>
-              </w:rPr>
-              <w:t>esta</w:t>
-            </w:r>
-            <w:r>
-              <w:rPr>
-                <w:rFonts w:ascii="Calibri" w:hAnsi="Calibri" w:cs="Arial"/>
-                <w:i/>
-                <w:color w:val="548DD4"/>
-                <w:sz w:val="20"/>
-                <w:szCs w:val="20"/>
-                <w:lang w:eastAsia="es-CL"/>
-              </w:rPr>
-              <w:t>(</w:t>
-            </w:r>
-            <w:r>
-              <w:rPr>
-                <w:rFonts w:ascii="Calibri" w:hAnsi="Calibri" w:cs="Arial"/>
-                <w:i/>
-                <w:color w:val="548DD4"/>
-                <w:sz w:val="20"/>
-                <w:szCs w:val="20"/>
-                <w:lang w:eastAsia="es-CL"/>
-              </w:rPr>
-              <w:t>s</w:t>
-            </w:r>
-            <w:r>
-              <w:rPr>
-                <w:rFonts w:ascii="Calibri" w:hAnsi="Calibri" w:cs="Arial"/>
-                <w:i/>
-                <w:color w:val="548DD4"/>
-                <w:sz w:val="20"/>
-                <w:szCs w:val="20"/>
-                <w:lang w:eastAsia="es-CL"/>
-              </w:rPr>
-              <w:t>)</w:t>
-            </w:r>
-            <w:r>
-              <w:rPr>
-                <w:rFonts w:ascii="Calibri" w:hAnsi="Calibri" w:cs="Arial"/>
-                <w:i/>
-                <w:color w:val="548DD4"/>
-                <w:sz w:val="20"/>
-                <w:szCs w:val="20"/>
-                <w:lang w:eastAsia="es-CL"/>
-              </w:rPr>
-              <w:t xml:space="preserve"> evidencia</w:t>
-            </w:r>
-            <w:r>
-              <w:rPr>
-                <w:rFonts w:ascii="Calibri" w:hAnsi="Calibri" w:cs="Arial"/>
-                <w:i/>
-                <w:color w:val="548DD4"/>
-                <w:sz w:val="20"/>
-                <w:szCs w:val="20"/>
-                <w:lang w:eastAsia="es-CL"/>
-              </w:rPr>
-              <w:t>(</w:t>
-            </w:r>
-            <w:r>
-              <w:rPr>
-                <w:rFonts w:ascii="Calibri" w:hAnsi="Calibri" w:cs="Arial"/>
-                <w:i/>
-                <w:color w:val="548DD4"/>
-                <w:sz w:val="20"/>
-                <w:szCs w:val="20"/>
-                <w:lang w:eastAsia="es-CL"/>
-              </w:rPr>
-              <w:t>s</w:t>
-            </w:r>
-            <w:r>
-              <w:rPr>
-                <w:rFonts w:ascii="Calibri" w:hAnsi="Calibri" w:cs="Arial"/>
-                <w:i/>
-                <w:color w:val="548DD4"/>
-                <w:sz w:val="20"/>
-                <w:szCs w:val="20"/>
-                <w:lang w:eastAsia="es-CL"/>
-              </w:rPr>
-              <w:t>)</w:t>
-            </w:r>
-            <w:r>
-              <w:rPr>
-                <w:rFonts w:ascii="Calibri" w:hAnsi="Calibri" w:cs="Arial"/>
-                <w:i/>
-                <w:color w:val="548DD4"/>
-                <w:sz w:val="20"/>
-                <w:szCs w:val="20"/>
-                <w:lang w:eastAsia="es-CL"/>
-              </w:rPr>
-              <w:t xml:space="preserve"> </w:t>
-            </w:r>
-            <w:r>
-              <w:rPr>
-                <w:rFonts w:ascii="Calibri" w:hAnsi="Calibri" w:cs="Arial"/>
-                <w:i/>
-                <w:color w:val="548DD4"/>
-                <w:sz w:val="20"/>
-                <w:szCs w:val="20"/>
-                <w:lang w:eastAsia="es-CL"/>
-              </w:rPr>
-              <w:t xml:space="preserve">permite(n) </w:t>
-            </w:r>
-            <w:r>
-              <w:rPr>
-                <w:rFonts w:ascii="Calibri" w:hAnsi="Calibri" w:cs="Arial"/>
-                <w:i/>
-                <w:color w:val="548DD4"/>
-                <w:sz w:val="20"/>
-                <w:szCs w:val="20"/>
-                <w:lang w:eastAsia="es-CL"/>
-              </w:rPr>
-              <w:t>da</w:t>
-            </w:r>
-            <w:r>
-              <w:rPr>
-                <w:rFonts w:ascii="Calibri" w:hAnsi="Calibri" w:cs="Arial"/>
-                <w:i/>
-                <w:color w:val="548DD4"/>
-                <w:sz w:val="20"/>
-                <w:szCs w:val="20"/>
-                <w:lang w:eastAsia="es-CL"/>
-              </w:rPr>
-              <w:t>r</w:t>
-            </w:r>
-            <w:r>
-              <w:rPr>
-                <w:rFonts w:ascii="Calibri" w:hAnsi="Calibri" w:cs="Arial"/>
-                <w:i/>
-                <w:color w:val="548DD4"/>
-                <w:sz w:val="20"/>
-                <w:szCs w:val="20"/>
-                <w:lang w:eastAsia="es-CL"/>
-              </w:rPr>
-              <w:t xml:space="preserve"> cuenta del </w:t>
-            </w:r>
-            <w:r>
-              <w:rPr>
-                <w:rFonts w:ascii="Calibri" w:hAnsi="Calibri" w:cs="Arial"/>
-                <w:i/>
-                <w:color w:val="548DD4"/>
-                <w:sz w:val="20"/>
-                <w:szCs w:val="20"/>
-                <w:lang w:eastAsia="es-CL"/>
-              </w:rPr>
-              <w:t>desarrollo</w:t>
-            </w:r>
-            <w:r>
-              <w:rPr>
-                <w:rFonts w:ascii="Calibri" w:hAnsi="Calibri" w:cs="Arial"/>
-                <w:i/>
-                <w:color w:val="548DD4"/>
-                <w:sz w:val="20"/>
-                <w:szCs w:val="20"/>
-                <w:lang w:eastAsia="es-CL"/>
-              </w:rPr>
-              <w:t xml:space="preserve"> </w:t>
-            </w:r>
-            <w:r>
-              <w:rPr>
-                <w:rFonts w:ascii="Calibri" w:hAnsi="Calibri" w:cs="Arial"/>
-                <w:i/>
-                <w:color w:val="548DD4"/>
-                <w:sz w:val="20"/>
-                <w:szCs w:val="20"/>
-                <w:lang w:eastAsia="es-CL"/>
-              </w:rPr>
-              <w:t>del proyecto.</w:t>
-            </w:r>
-          </w:p>
-          <w:p>
-            <w:pPr>
-              <w:jc w:val="both"/>
-              <w:rPr>
-                <w:rFonts w:ascii="Calibri" w:hAnsi="Calibri" w:cs="Arial"/>
-                <w:i/>
-                <w:color w:val="548DD4"/>
-                <w:sz w:val="20"/>
-                <w:szCs w:val="20"/>
-                <w:lang w:eastAsia="es-CL"/>
-              </w:rPr>
-            </w:pPr>
-            <w:r>
-              <w:rPr>
-                <w:rFonts w:ascii="Calibri" w:hAnsi="Calibri" w:cs="Arial"/>
-                <w:i/>
-                <w:color w:val="548DD4"/>
-                <w:sz w:val="20"/>
-                <w:szCs w:val="20"/>
-                <w:lang w:eastAsia="es-CL"/>
-              </w:rPr>
-              <w:t xml:space="preserve">En caso de ser pertinente </w:t>
-            </w:r>
-            <w:r>
-              <w:rPr>
-                <w:rFonts w:ascii="Calibri" w:hAnsi="Calibri" w:cs="Arial"/>
-                <w:i/>
-                <w:color w:val="548DD4"/>
-                <w:sz w:val="20"/>
-                <w:szCs w:val="20"/>
-                <w:lang w:eastAsia="es-CL"/>
-              </w:rPr>
-              <w:t>explica cómo resguardaste la calidad de tu Proyecto APT a partir de aspectos propios de tu disciplina (correcta aplicación de metodologías, actividades, herramientas, recursos propios, etc.).</w:t>
-            </w:r>
-          </w:p>
-          <w:p>
-            <w:pPr>
-              <w:jc w:val="both"/>
-              <w:rPr>
-                <w:rFonts w:ascii="Calibri" w:hAnsi="Calibri" w:cs="Arial"/>
-                <w:b/>
-                <w:i/>
-                <w:color w:val="548DD4"/>
-                <w:sz w:val="20"/>
-                <w:szCs w:val="20"/>
-                <w:lang w:eastAsia="es-CL"/>
-              </w:rPr>
-            </w:pPr>
-            <w:r>
-              <w:rPr>
-                <w:rFonts w:ascii="Calibri" w:hAnsi="Calibri" w:cs="Arial"/>
-                <w:i/>
-                <w:color w:val="548DD4"/>
-                <w:sz w:val="20"/>
-                <w:szCs w:val="20"/>
-                <w:lang w:eastAsia="es-CL"/>
-              </w:rPr>
-              <w:t>En este apartado adjuntar la(s) evidencia(s) seleccionada(s) para ser evaluada por el docente.</w:t>
+                <w:bCs/>
+                <w:iCs/>
+                <w:color w:val="548DD4"/>
+                <w:sz w:val="20"/>
+                <w:szCs w:val="20"/>
+                <w:lang w:eastAsia="es-CL"/>
+              </w:rPr>
+            </w:pPr>
+            <w:r>
+              <w:rPr>
+                <w:rFonts w:ascii="Calibri" w:hAnsi="Calibri" w:cs="Arial"/>
+                <w:bCs/>
+                <w:iCs/>
+                <w:color w:val="548DD4"/>
+                <w:sz w:val="20"/>
+                <w:szCs w:val="20"/>
+                <w:lang w:eastAsia="es-CL"/>
+              </w:rPr>
+              <w:t xml:space="preserve">Como evidencia principal se presenta el documento técnico "Especificaciones Técnicas y Requerimientos - Sistema Captura Digital y Gestión de Prospectos", el </w:t>
+            </w:r>
+            <w:proofErr w:type="gramStart"/>
+            <w:r>
+              <w:rPr>
+                <w:rFonts w:ascii="Calibri" w:hAnsi="Calibri" w:cs="Arial"/>
+                <w:bCs/>
+                <w:iCs/>
+                <w:color w:val="548DD4"/>
+                <w:sz w:val="20"/>
+                <w:szCs w:val="20"/>
+                <w:lang w:eastAsia="es-CL"/>
+              </w:rPr>
+              <w:t>cual</w:t>
+            </w:r>
+            <w:proofErr w:type="gramEnd"/>
+            <w:r>
+              <w:rPr>
+                <w:rFonts w:ascii="Calibri" w:hAnsi="Calibri" w:cs="Arial"/>
+                <w:bCs/>
+                <w:iCs/>
+                <w:color w:val="548DD4"/>
+                <w:sz w:val="20"/>
+                <w:szCs w:val="20"/>
+                <w:lang w:eastAsia="es-CL"/>
+              </w:rPr>
+              <w:t xml:space="preserve"> valida la viabilidad técnica, la definición de arquitectura, la selección de librerías especializadas (como </w:t>
+            </w:r>
+            <w:r>
+              <w:rPr>
+                <w:rFonts w:ascii="Calibri" w:hAnsi="Calibri" w:cs="Arial"/>
+                <w:bCs/>
+                <w:iCs/>
+                <w:color w:val="EE0000"/>
+                <w:sz w:val="20"/>
+                <w:szCs w:val="20"/>
+                <w:lang w:eastAsia="es-CL"/>
+              </w:rPr>
+              <w:t xml:space="preserve">@zxing/library, </w:t>
+            </w:r>
+            <w:proofErr w:type="spellStart"/>
+            <w:r>
+              <w:rPr>
+                <w:rFonts w:ascii="Calibri" w:hAnsi="Calibri" w:cs="Arial"/>
+                <w:bCs/>
+                <w:iCs/>
+                <w:color w:val="EE0000"/>
+                <w:sz w:val="20"/>
+                <w:szCs w:val="20"/>
+                <w:lang w:eastAsia="es-CL"/>
+              </w:rPr>
+              <w:t>mrz</w:t>
+            </w:r>
+            <w:proofErr w:type="spellEnd"/>
+            <w:r>
+              <w:rPr>
+                <w:rFonts w:ascii="Calibri" w:hAnsi="Calibri" w:cs="Arial"/>
+                <w:bCs/>
+                <w:iCs/>
+                <w:color w:val="EE0000"/>
+                <w:sz w:val="20"/>
+                <w:szCs w:val="20"/>
+                <w:lang w:eastAsia="es-CL"/>
+              </w:rPr>
+              <w:t xml:space="preserve">, dexie.js y </w:t>
+            </w:r>
+            <w:proofErr w:type="spellStart"/>
+            <w:r>
+              <w:rPr>
+                <w:rFonts w:ascii="Calibri" w:hAnsi="Calibri" w:cs="Arial"/>
+                <w:bCs/>
+                <w:iCs/>
+                <w:color w:val="EE0000"/>
+                <w:sz w:val="20"/>
+                <w:szCs w:val="20"/>
+                <w:lang w:eastAsia="es-CL"/>
+              </w:rPr>
+              <w:t>workbox</w:t>
+            </w:r>
+            <w:proofErr w:type="spellEnd"/>
+            <w:r>
+              <w:rPr>
+                <w:rFonts w:ascii="Calibri" w:hAnsi="Calibri" w:cs="Arial"/>
+                <w:bCs/>
+                <w:iCs/>
+                <w:color w:val="548DD4"/>
+                <w:sz w:val="20"/>
+                <w:szCs w:val="20"/>
+                <w:lang w:eastAsia="es-CL"/>
+              </w:rPr>
+              <w:t>) y la asignación formal de roles del equipo de trabajo. Esto asegura la correcta aplicación de estándares de desarrollo de software y gestión de bases de datos de la Escuela de Informática y Telecomunicaciones.</w:t>
             </w:r>
           </w:p>
         </w:tc>
@@ -1427,7 +1235,7 @@
       <w:tblPr>
         <w:tblStyle w:val="Tablaconcuadrcula"/>
         <w:tblpPr w:leftFromText="180" w:rightFromText="180" w:vertAnchor="page" w:horzAnchor="margin" w:tblpXSpec="center" w:tblpY="3517"/>
-        <w:tblW w:w="9776" w:type="dxa"/>
+        <w:tblW w:w="9191" w:type="dxa"/>
         <w:tblBorders>
           <w:top w:val="single" w:sz="4" w:space="0" w:color="BFBFBF" w:themeColor="background1" w:themeShade="BF"/>
           <w:left w:val="single" w:sz="4" w:space="0" w:color="BFBFBF" w:themeColor="background1" w:themeShade="BF"/>
@@ -1441,21 +1249,21 @@
       </w:tblPr>
       <w:tblGrid>
         <w:gridCol w:w="1328"/>
-        <w:gridCol w:w="1077"/>
-        <w:gridCol w:w="1276"/>
-        <w:gridCol w:w="1276"/>
-        <w:gridCol w:w="1275"/>
-        <w:gridCol w:w="1276"/>
-        <w:gridCol w:w="1418"/>
-        <w:gridCol w:w="850"/>
+        <w:gridCol w:w="1332"/>
+        <w:gridCol w:w="1066"/>
+        <w:gridCol w:w="1199"/>
+        <w:gridCol w:w="1199"/>
+        <w:gridCol w:w="932"/>
+        <w:gridCol w:w="1333"/>
+        <w:gridCol w:w="802"/>
       </w:tblGrid>
       <w:tr>
         <w:trPr>
-          <w:trHeight w:val="415"/>
+          <w:trHeight w:val="389"/>
         </w:trPr>
         <w:tc>
           <w:tcPr>
-            <w:tcW w:w="9776" w:type="dxa"/>
+            <w:tcW w:w="9191" w:type="dxa"/>
             <w:gridSpan w:val="8"/>
             <w:vAlign w:val="center"/>
           </w:tcPr>
@@ -1481,7 +1289,7 @@
       </w:tr>
       <w:tr>
         <w:trPr>
-          <w:trHeight w:val="711"/>
+          <w:trHeight w:val="668"/>
         </w:trPr>
         <w:tc>
           <w:tcPr>
@@ -1525,7 +1333,7 @@
         </w:tc>
         <w:tc>
           <w:tcPr>
-            <w:tcW w:w="1077" w:type="dxa"/>
+            <w:tcW w:w="1332" w:type="dxa"/>
             <w:vAlign w:val="center"/>
           </w:tcPr>
           <w:p>
@@ -1549,7 +1357,7 @@
         </w:tc>
         <w:tc>
           <w:tcPr>
-            <w:tcW w:w="1276" w:type="dxa"/>
+            <w:tcW w:w="1066" w:type="dxa"/>
             <w:vAlign w:val="center"/>
           </w:tcPr>
           <w:p>
@@ -1573,7 +1381,7 @@
         </w:tc>
         <w:tc>
           <w:tcPr>
-            <w:tcW w:w="1276" w:type="dxa"/>
+            <w:tcW w:w="1199" w:type="dxa"/>
             <w:vAlign w:val="center"/>
           </w:tcPr>
           <w:p>
@@ -1597,7 +1405,7 @@
         </w:tc>
         <w:tc>
           <w:tcPr>
-            <w:tcW w:w="1275" w:type="dxa"/>
+            <w:tcW w:w="1199" w:type="dxa"/>
             <w:vAlign w:val="center"/>
           </w:tcPr>
           <w:p>
@@ -1630,7 +1438,7 @@
         </w:tc>
         <w:tc>
           <w:tcPr>
-            <w:tcW w:w="1276" w:type="dxa"/>
+            <w:tcW w:w="932" w:type="dxa"/>
             <w:vAlign w:val="center"/>
           </w:tcPr>
           <w:p>
@@ -1654,7 +1462,7 @@
         </w:tc>
         <w:tc>
           <w:tcPr>
-            <w:tcW w:w="1418" w:type="dxa"/>
+            <w:tcW w:w="1333" w:type="dxa"/>
             <w:vAlign w:val="center"/>
           </w:tcPr>
           <w:p>
@@ -1678,7 +1486,7 @@
         </w:tc>
         <w:tc>
           <w:tcPr>
-            <w:tcW w:w="850" w:type="dxa"/>
+            <w:tcW w:w="799" w:type="dxa"/>
             <w:vAlign w:val="center"/>
           </w:tcPr>
           <w:p>
@@ -1711,7 +1519,7 @@
       </w:tr>
       <w:tr>
         <w:trPr>
-          <w:trHeight w:val="2410"/>
+          <w:trHeight w:val="2264"/>
         </w:trPr>
         <w:tc>
           <w:tcPr>
@@ -1721,6 +1529,113 @@
             <w:pPr>
               <w:jc w:val="both"/>
               <w:rPr>
+                <w:bCs/>
+                <w:sz w:val="18"/>
+                <w:szCs w:val="24"/>
+              </w:rPr>
+            </w:pPr>
+            <w:r>
+              <w:rPr>
+                <w:bCs/>
+                <w:sz w:val="18"/>
+                <w:szCs w:val="24"/>
+              </w:rPr>
+              <w:t>Modelado</w:t>
+            </w:r>
+            <w:r>
+              <w:rPr>
+                <w:bCs/>
+                <w:sz w:val="18"/>
+                <w:szCs w:val="24"/>
+              </w:rPr>
+              <w:t xml:space="preserve"> </w:t>
+            </w:r>
+            <w:r>
+              <w:rPr>
+                <w:bCs/>
+                <w:sz w:val="18"/>
+                <w:szCs w:val="24"/>
+              </w:rPr>
+              <w:t>y especificación de requerimientos de</w:t>
+            </w:r>
+            <w:r>
+              <w:rPr>
+                <w:bCs/>
+                <w:sz w:val="18"/>
+                <w:szCs w:val="24"/>
+              </w:rPr>
+              <w:t xml:space="preserve"> </w:t>
+            </w:r>
+            <w:r>
+              <w:rPr>
+                <w:bCs/>
+                <w:sz w:val="18"/>
+                <w:szCs w:val="24"/>
+              </w:rPr>
+              <w:t>software para entornos móviles y web.</w:t>
+            </w:r>
+          </w:p>
+        </w:tc>
+        <w:tc>
+          <w:tcPr>
+            <w:tcW w:w="1332" w:type="dxa"/>
+          </w:tcPr>
+          <w:p>
+            <w:pPr>
+              <w:jc w:val="both"/>
+              <w:rPr>
+                <w:rFonts w:ascii="Calibri" w:hAnsi="Calibri" w:cs="Arial"/>
+                <w:iCs/>
+                <w:color w:val="548DD4"/>
+                <w:sz w:val="18"/>
+                <w:szCs w:val="20"/>
+                <w:lang w:eastAsia="es-CL"/>
+              </w:rPr>
+            </w:pPr>
+            <w:r>
+              <w:rPr>
+                <w:rFonts w:ascii="Calibri" w:hAnsi="Calibri" w:cs="Arial"/>
+                <w:iCs/>
+                <w:color w:val="548DD4"/>
+                <w:sz w:val="18"/>
+                <w:szCs w:val="20"/>
+                <w:lang w:eastAsia="es-CL"/>
+              </w:rPr>
+              <w:t>Elaboración del documento de especificaciones técnicas, arquitectura y requerimientos del sistema.</w:t>
+            </w:r>
+          </w:p>
+        </w:tc>
+        <w:tc>
+          <w:tcPr>
+            <w:tcW w:w="1066" w:type="dxa"/>
+          </w:tcPr>
+          <w:p>
+            <w:pPr>
+              <w:jc w:val="both"/>
+              <w:rPr>
+                <w:bCs/>
+                <w:sz w:val="18"/>
+                <w:szCs w:val="24"/>
+              </w:rPr>
+            </w:pPr>
+            <w:r>
+              <w:rPr>
+                <w:bCs/>
+                <w:sz w:val="18"/>
+                <w:szCs w:val="24"/>
+              </w:rPr>
+              <w:t>Documentación institucional, normativas de admisión, herramientas de ofimática.</w:t>
+            </w:r>
+          </w:p>
+        </w:tc>
+        <w:tc>
+          <w:tcPr>
+            <w:tcW w:w="1199" w:type="dxa"/>
+          </w:tcPr>
+          <w:p>
+            <w:pPr>
+              <w:jc w:val="both"/>
+              <w:rPr>
                 <w:b/>
                 <w:sz w:val="18"/>
                 <w:szCs w:val="24"/>
@@ -1728,64 +1643,17 @@
             </w:pPr>
             <w:r>
               <w:rPr>
-                <w:rFonts w:ascii="Calibri" w:hAnsi="Calibri" w:cs="Arial"/>
-                <w:i/>
-                <w:color w:val="548DD4"/>
+                <w:b/>
                 <w:sz w:val="18"/>
-                <w:szCs w:val="20"/>
-                <w:lang w:eastAsia="es-CL"/>
-              </w:rPr>
-              <w:t xml:space="preserve">Nombra las competencias o unidades de competencias </w:t>
-            </w:r>
-            <w:r>
-              <w:rPr>
-                <w:rFonts w:ascii="Calibri" w:hAnsi="Calibri" w:cs="Arial"/>
-                <w:i/>
-                <w:color w:val="548DD4"/>
-                <w:sz w:val="18"/>
-                <w:szCs w:val="20"/>
-                <w:lang w:eastAsia="es-CL"/>
-              </w:rPr>
-              <w:t xml:space="preserve">que se relacionan con las diferentes actividades </w:t>
-            </w:r>
-            <w:r>
-              <w:rPr>
-                <w:rFonts w:ascii="Calibri" w:hAnsi="Calibri" w:cs="Arial"/>
-                <w:i/>
-                <w:color w:val="548DD4"/>
-                <w:sz w:val="18"/>
-                <w:szCs w:val="20"/>
-                <w:lang w:eastAsia="es-CL"/>
-              </w:rPr>
-              <w:t>requeridas para el desarrollo de</w:t>
-            </w:r>
-            <w:r>
-              <w:rPr>
-                <w:rFonts w:ascii="Calibri" w:hAnsi="Calibri" w:cs="Arial"/>
-                <w:i/>
-                <w:color w:val="548DD4"/>
-                <w:sz w:val="18"/>
-                <w:szCs w:val="20"/>
-                <w:lang w:eastAsia="es-CL"/>
-              </w:rPr>
-              <w:t>l proyecto APT</w:t>
-            </w:r>
-            <w:r>
-              <w:rPr>
-                <w:rFonts w:ascii="Calibri" w:hAnsi="Calibri" w:cs="Arial"/>
-                <w:i/>
-                <w:color w:val="548DD4"/>
-                <w:sz w:val="18"/>
-                <w:szCs w:val="20"/>
-                <w:lang w:eastAsia="es-CL"/>
-              </w:rPr>
-              <w:t>.</w:t>
+                <w:szCs w:val="24"/>
+              </w:rPr>
+              <w:t>2 semanas</w:t>
             </w:r>
           </w:p>
         </w:tc>
         <w:tc>
           <w:tcPr>
-            <w:tcW w:w="1077" w:type="dxa"/>
+            <w:tcW w:w="1199" w:type="dxa"/>
           </w:tcPr>
           <w:p>
             <w:pPr>
@@ -1799,184 +1667,58 @@
                 <w:lang w:eastAsia="es-CL"/>
               </w:rPr>
             </w:pPr>
-            <w:r>
-              <w:rPr>
-                <w:rFonts w:ascii="Calibri" w:hAnsi="Calibri" w:cs="Arial"/>
-                <w:i/>
-                <w:color w:val="548DD4"/>
-                <w:sz w:val="18"/>
-                <w:szCs w:val="20"/>
-                <w:lang w:eastAsia="es-CL"/>
-              </w:rPr>
-              <w:t>Nombra</w:t>
-            </w:r>
-            <w:r>
-              <w:rPr>
-                <w:rFonts w:ascii="Calibri" w:hAnsi="Calibri" w:cs="Arial"/>
-                <w:i/>
-                <w:color w:val="548DD4"/>
-                <w:sz w:val="18"/>
-                <w:szCs w:val="20"/>
-                <w:lang w:eastAsia="es-CL"/>
-              </w:rPr>
-              <w:t xml:space="preserve"> la</w:t>
-            </w:r>
-            <w:r>
-              <w:rPr>
-                <w:rFonts w:ascii="Calibri" w:hAnsi="Calibri" w:cs="Arial"/>
-                <w:i/>
-                <w:color w:val="548DD4"/>
-                <w:sz w:val="18"/>
-                <w:szCs w:val="20"/>
-                <w:lang w:eastAsia="es-CL"/>
-              </w:rPr>
-              <w:t>s</w:t>
-            </w:r>
-            <w:r>
-              <w:rPr>
-                <w:rFonts w:ascii="Calibri" w:hAnsi="Calibri" w:cs="Arial"/>
-                <w:i/>
-                <w:color w:val="548DD4"/>
-                <w:sz w:val="18"/>
-                <w:szCs w:val="20"/>
-                <w:lang w:eastAsia="es-CL"/>
-              </w:rPr>
-              <w:t xml:space="preserve"> </w:t>
-            </w:r>
-            <w:r>
-              <w:rPr>
-                <w:rFonts w:ascii="Calibri" w:hAnsi="Calibri" w:cs="Arial"/>
-                <w:i/>
-                <w:color w:val="548DD4"/>
-                <w:sz w:val="18"/>
-                <w:szCs w:val="20"/>
-                <w:lang w:eastAsia="es-CL"/>
-              </w:rPr>
-              <w:t xml:space="preserve">actividades que se necesitan para desarrollar el proyecto APT. </w:t>
-            </w:r>
           </w:p>
         </w:tc>
         <w:tc>
           <w:tcPr>
-            <w:tcW w:w="1276" w:type="dxa"/>
+            <w:tcW w:w="932" w:type="dxa"/>
           </w:tcPr>
           <w:p>
             <w:pPr>
               <w:jc w:val="both"/>
               <w:rPr>
-                <w:b/>
+                <w:rFonts w:ascii="Calibri" w:hAnsi="Calibri" w:cs="Arial"/>
+                <w:i/>
+                <w:color w:val="548DD4"/>
                 <w:sz w:val="18"/>
-                <w:szCs w:val="24"/>
-              </w:rPr>
-            </w:pPr>
-            <w:r>
-              <w:rPr>
-                <w:rFonts w:ascii="Calibri" w:hAnsi="Calibri" w:cs="Arial"/>
-                <w:i/>
-                <w:color w:val="548DD4"/>
-                <w:sz w:val="18"/>
-                <w:szCs w:val="20"/>
-                <w:lang w:eastAsia="es-CL"/>
-              </w:rPr>
-              <w:t>Nombra los recursos necesarios para llevar a cabo las actividades</w:t>
-            </w:r>
-            <w:r>
-              <w:rPr>
-                <w:rFonts w:ascii="Calibri" w:hAnsi="Calibri" w:cs="Arial"/>
-                <w:i/>
-                <w:color w:val="548DD4"/>
-                <w:sz w:val="18"/>
-                <w:szCs w:val="20"/>
-                <w:lang w:eastAsia="es-CL"/>
-              </w:rPr>
-              <w:t xml:space="preserve"> </w:t>
-            </w:r>
-            <w:r>
-              <w:rPr>
-                <w:rFonts w:ascii="Calibri" w:hAnsi="Calibri" w:cs="Arial"/>
-                <w:i/>
-                <w:color w:val="548DD4"/>
-                <w:sz w:val="18"/>
-                <w:szCs w:val="20"/>
-                <w:lang w:eastAsia="es-CL"/>
-              </w:rPr>
-              <w:t>definidas.</w:t>
-            </w:r>
+                <w:szCs w:val="20"/>
+                <w:lang w:eastAsia="es-CL"/>
+              </w:rPr>
+            </w:pPr>
           </w:p>
         </w:tc>
         <w:tc>
           <w:tcPr>
-            <w:tcW w:w="1276" w:type="dxa"/>
+            <w:tcW w:w="1333" w:type="dxa"/>
           </w:tcPr>
           <w:p>
             <w:pPr>
               <w:jc w:val="both"/>
               <w:rPr>
-                <w:b/>
-                <w:sz w:val="18"/>
-                <w:szCs w:val="24"/>
-              </w:rPr>
-            </w:pPr>
-            <w:r>
-              <w:rPr>
                 <w:rFonts w:ascii="Calibri" w:hAnsi="Calibri" w:cs="Arial"/>
                 <w:i/>
-                <w:color w:val="548DD4"/>
-                <w:sz w:val="18"/>
-                <w:szCs w:val="20"/>
-                <w:lang w:eastAsia="es-CL"/>
-              </w:rPr>
-              <w:t xml:space="preserve">Señala </w:t>
-            </w:r>
+                <w:color w:val="C00000"/>
+                <w:sz w:val="16"/>
+                <w:szCs w:val="20"/>
+                <w:lang w:eastAsia="es-CL"/>
+              </w:rPr>
+            </w:pPr>
             <w:r>
               <w:rPr>
                 <w:rFonts w:ascii="Calibri" w:hAnsi="Calibri" w:cs="Arial"/>
                 <w:i/>
-                <w:color w:val="548DD4"/>
-                <w:sz w:val="18"/>
-                <w:szCs w:val="20"/>
-                <w:lang w:eastAsia="es-CL"/>
-              </w:rPr>
-              <w:t>la duración de</w:t>
-            </w:r>
-            <w:r>
-              <w:rPr>
-                <w:rFonts w:ascii="Calibri" w:hAnsi="Calibri" w:cs="Arial"/>
-                <w:i/>
-                <w:color w:val="548DD4"/>
-                <w:sz w:val="18"/>
-                <w:szCs w:val="20"/>
-                <w:lang w:eastAsia="es-CL"/>
-              </w:rPr>
-              <w:t xml:space="preserve"> cada </w:t>
-            </w:r>
-            <w:r>
-              <w:rPr>
-                <w:rFonts w:ascii="Calibri" w:hAnsi="Calibri" w:cs="Arial"/>
-                <w:i/>
-                <w:color w:val="548DD4"/>
-                <w:sz w:val="18"/>
-                <w:szCs w:val="20"/>
-                <w:lang w:eastAsia="es-CL"/>
-              </w:rPr>
-              <w:t>actividad</w:t>
-            </w:r>
-            <w:r>
-              <w:rPr>
-                <w:rFonts w:ascii="Calibri" w:hAnsi="Calibri" w:cs="Arial"/>
-                <w:i/>
-                <w:color w:val="548DD4"/>
-                <w:sz w:val="18"/>
-                <w:szCs w:val="20"/>
-                <w:lang w:eastAsia="es-CL"/>
-              </w:rPr>
-              <w:t xml:space="preserve">. </w:t>
+                <w:color w:val="C00000"/>
+                <w:sz w:val="16"/>
+                <w:szCs w:val="20"/>
+                <w:lang w:eastAsia="es-CL"/>
+              </w:rPr>
+              <w:t xml:space="preserve"> </w:t>
             </w:r>
           </w:p>
         </w:tc>
         <w:tc>
           <w:tcPr>
-            <w:tcW w:w="1275" w:type="dxa"/>
+            <w:tcW w:w="799" w:type="dxa"/>
           </w:tcPr>
           <w:p>
             <w:pPr>
@@ -1990,319 +1732,6 @@
                 <w:lang w:eastAsia="es-CL"/>
               </w:rPr>
             </w:pPr>
-            <w:r>
-              <w:rPr>
-                <w:rFonts w:ascii="Calibri" w:hAnsi="Calibri" w:cs="Arial"/>
-                <w:i/>
-                <w:color w:val="548DD4"/>
-                <w:sz w:val="18"/>
-                <w:szCs w:val="20"/>
-                <w:lang w:eastAsia="es-CL"/>
-              </w:rPr>
-              <w:t xml:space="preserve">Escribe el </w:t>
-            </w:r>
-            <w:r>
-              <w:rPr>
-                <w:rFonts w:ascii="Calibri" w:hAnsi="Calibri" w:cs="Arial"/>
-                <w:i/>
-                <w:color w:val="548DD4"/>
-                <w:sz w:val="18"/>
-                <w:szCs w:val="20"/>
-                <w:lang w:eastAsia="es-CL"/>
-              </w:rPr>
-              <w:t xml:space="preserve">nombre del integrante del equipo responsable de </w:t>
-            </w:r>
-            <w:r>
-              <w:rPr>
-                <w:rFonts w:ascii="Calibri" w:hAnsi="Calibri" w:cs="Arial"/>
-                <w:i/>
-                <w:color w:val="548DD4"/>
-                <w:sz w:val="18"/>
-                <w:szCs w:val="20"/>
-                <w:lang w:eastAsia="es-CL"/>
-              </w:rPr>
-              <w:t xml:space="preserve">cada </w:t>
-            </w:r>
-            <w:r>
-              <w:rPr>
-                <w:rFonts w:ascii="Calibri" w:hAnsi="Calibri" w:cs="Arial"/>
-                <w:i/>
-                <w:color w:val="548DD4"/>
-                <w:sz w:val="18"/>
-                <w:szCs w:val="20"/>
-                <w:lang w:eastAsia="es-CL"/>
-              </w:rPr>
-              <w:t>actividad.</w:t>
-            </w:r>
-          </w:p>
-        </w:tc>
-        <w:tc>
-          <w:tcPr>
-            <w:tcW w:w="1276" w:type="dxa"/>
-          </w:tcPr>
-          <w:p>
-            <w:pPr>
-              <w:jc w:val="both"/>
-              <w:rPr>
-                <w:rFonts w:ascii="Calibri" w:hAnsi="Calibri" w:cs="Arial"/>
-                <w:i/>
-                <w:color w:val="548DD4"/>
-                <w:sz w:val="18"/>
-                <w:szCs w:val="20"/>
-                <w:lang w:eastAsia="es-CL"/>
-              </w:rPr>
-            </w:pPr>
-            <w:r>
-              <w:rPr>
-                <w:rFonts w:ascii="Calibri" w:hAnsi="Calibri" w:cs="Arial"/>
-                <w:i/>
-                <w:color w:val="548DD4"/>
-                <w:sz w:val="18"/>
-                <w:szCs w:val="20"/>
-                <w:lang w:eastAsia="es-CL"/>
-              </w:rPr>
-              <w:t xml:space="preserve">Señala </w:t>
-            </w:r>
-            <w:r>
-              <w:rPr>
-                <w:rFonts w:ascii="Calibri" w:hAnsi="Calibri" w:cs="Arial"/>
-                <w:i/>
-                <w:color w:val="548DD4"/>
-                <w:sz w:val="18"/>
-                <w:szCs w:val="20"/>
-                <w:lang w:eastAsia="es-CL"/>
-              </w:rPr>
-              <w:t>las dific</w:t>
-            </w:r>
-            <w:r>
-              <w:rPr>
-                <w:rFonts w:ascii="Calibri" w:hAnsi="Calibri" w:cs="Arial"/>
-                <w:i/>
-                <w:color w:val="548DD4"/>
-                <w:sz w:val="18"/>
-                <w:szCs w:val="20"/>
-                <w:lang w:eastAsia="es-CL"/>
-              </w:rPr>
-              <w:t>ult</w:t>
-            </w:r>
-            <w:r>
-              <w:rPr>
-                <w:rFonts w:ascii="Calibri" w:hAnsi="Calibri" w:cs="Arial"/>
-                <w:i/>
-                <w:color w:val="548DD4"/>
-                <w:sz w:val="18"/>
-                <w:szCs w:val="20"/>
-                <w:lang w:eastAsia="es-CL"/>
-              </w:rPr>
-              <w:t>ades o facilitadores que se podrían presentar durante la ejecución de cada una de las actividades propuestas.</w:t>
-            </w:r>
-          </w:p>
-        </w:tc>
-        <w:tc>
-          <w:tcPr>
-            <w:tcW w:w="1418" w:type="dxa"/>
-          </w:tcPr>
-          <w:p>
-            <w:pPr>
-              <w:jc w:val="both"/>
-              <w:rPr>
-                <w:rFonts w:ascii="Calibri" w:hAnsi="Calibri" w:cs="Arial"/>
-                <w:i/>
-                <w:color w:val="548DD4"/>
-                <w:sz w:val="18"/>
-                <w:szCs w:val="20"/>
-                <w:lang w:eastAsia="es-CL"/>
-              </w:rPr>
-            </w:pPr>
-            <w:r>
-              <w:rPr>
-                <w:rFonts w:ascii="Calibri" w:hAnsi="Calibri" w:cs="Arial"/>
-                <w:i/>
-                <w:color w:val="548DD4"/>
-                <w:sz w:val="18"/>
-                <w:szCs w:val="20"/>
-                <w:lang w:eastAsia="es-CL"/>
-              </w:rPr>
-              <w:t>D</w:t>
-            </w:r>
-            <w:r>
-              <w:rPr>
-                <w:rFonts w:ascii="Calibri" w:hAnsi="Calibri" w:cs="Arial"/>
-                <w:i/>
-                <w:color w:val="548DD4"/>
-                <w:sz w:val="18"/>
-                <w:szCs w:val="20"/>
-                <w:lang w:eastAsia="es-CL"/>
-              </w:rPr>
-              <w:t>escribe</w:t>
-            </w:r>
-            <w:r>
-              <w:rPr>
-                <w:rFonts w:ascii="Calibri" w:hAnsi="Calibri" w:cs="Arial"/>
-                <w:i/>
-                <w:color w:val="548DD4"/>
-                <w:sz w:val="18"/>
-                <w:szCs w:val="20"/>
-                <w:lang w:eastAsia="es-CL"/>
-              </w:rPr>
-              <w:t xml:space="preserve"> el estado de avance </w:t>
-            </w:r>
-            <w:r>
-              <w:rPr>
-                <w:rFonts w:ascii="Calibri" w:hAnsi="Calibri" w:cs="Arial"/>
-                <w:i/>
-                <w:color w:val="548DD4"/>
-                <w:sz w:val="18"/>
-                <w:szCs w:val="20"/>
-                <w:lang w:eastAsia="es-CL"/>
-              </w:rPr>
-              <w:t>de cada actividad.</w:t>
-            </w:r>
-          </w:p>
-          <w:p>
-            <w:pPr>
-              <w:jc w:val="both"/>
-              <w:rPr>
-                <w:rFonts w:ascii="Calibri" w:hAnsi="Calibri" w:cs="Arial"/>
-                <w:i/>
-                <w:color w:val="C00000"/>
-                <w:sz w:val="16"/>
-                <w:szCs w:val="20"/>
-                <w:lang w:eastAsia="es-CL"/>
-              </w:rPr>
-            </w:pPr>
-          </w:p>
-          <w:p>
-            <w:pPr>
-              <w:jc w:val="both"/>
-              <w:rPr>
-                <w:rFonts w:ascii="Calibri" w:hAnsi="Calibri" w:cs="Arial"/>
-                <w:i/>
-                <w:color w:val="548DD4"/>
-                <w:sz w:val="18"/>
-                <w:szCs w:val="20"/>
-                <w:lang w:eastAsia="es-CL"/>
-              </w:rPr>
-            </w:pPr>
-            <w:r>
-              <w:rPr>
-                <w:rFonts w:ascii="Calibri" w:hAnsi="Calibri" w:cs="Arial"/>
-                <w:i/>
-                <w:color w:val="548DD4"/>
-                <w:sz w:val="18"/>
-                <w:szCs w:val="20"/>
-                <w:lang w:eastAsia="es-CL"/>
-              </w:rPr>
-              <w:t xml:space="preserve">Tipos de estado: </w:t>
-            </w:r>
-          </w:p>
-          <w:p>
-            <w:pPr>
-              <w:jc w:val="both"/>
-              <w:rPr>
-                <w:rFonts w:ascii="Calibri" w:hAnsi="Calibri" w:cs="Arial"/>
-                <w:i/>
-                <w:color w:val="C00000"/>
-                <w:sz w:val="16"/>
-                <w:szCs w:val="20"/>
-                <w:lang w:eastAsia="es-CL"/>
-              </w:rPr>
-            </w:pPr>
-            <w:r>
-              <w:rPr>
-                <w:rFonts w:ascii="Calibri" w:hAnsi="Calibri" w:cs="Arial"/>
-                <w:i/>
-                <w:color w:val="548DD4"/>
-                <w:sz w:val="18"/>
-                <w:szCs w:val="20"/>
-                <w:lang w:eastAsia="es-CL"/>
-              </w:rPr>
-              <w:t>En curso/ Con retraso/ No iniciado/ Completado/ Ajustada</w:t>
-            </w:r>
-            <w:r>
-              <w:rPr>
-                <w:rFonts w:ascii="Calibri" w:hAnsi="Calibri" w:cs="Arial"/>
-                <w:i/>
-                <w:color w:val="C00000"/>
-                <w:sz w:val="16"/>
-                <w:szCs w:val="20"/>
-                <w:lang w:eastAsia="es-CL"/>
-              </w:rPr>
-              <w:t xml:space="preserve"> </w:t>
-            </w:r>
-          </w:p>
-        </w:tc>
-        <w:tc>
-          <w:tcPr>
-            <w:tcW w:w="850" w:type="dxa"/>
-          </w:tcPr>
-          <w:p>
-            <w:pPr>
-              <w:jc w:val="both"/>
-              <w:rPr>
-                <w:rFonts w:ascii="Calibri" w:hAnsi="Calibri" w:cs="Arial"/>
-                <w:i/>
-                <w:color w:val="548DD4"/>
-                <w:sz w:val="18"/>
-                <w:szCs w:val="20"/>
-                <w:lang w:eastAsia="es-CL"/>
-              </w:rPr>
-            </w:pPr>
-            <w:r>
-              <w:rPr>
-                <w:rFonts w:ascii="Calibri" w:hAnsi="Calibri" w:cs="Arial"/>
-                <w:i/>
-                <w:color w:val="548DD4"/>
-                <w:sz w:val="18"/>
-                <w:szCs w:val="20"/>
-                <w:lang w:eastAsia="es-CL"/>
-              </w:rPr>
-              <w:t>S</w:t>
-            </w:r>
-            <w:r>
-              <w:rPr>
-                <w:rFonts w:ascii="Calibri" w:hAnsi="Calibri" w:cs="Arial"/>
-                <w:i/>
-                <w:color w:val="548DD4"/>
-                <w:sz w:val="18"/>
-                <w:szCs w:val="20"/>
-                <w:lang w:eastAsia="es-CL"/>
-              </w:rPr>
-              <w:t>e</w:t>
-            </w:r>
-            <w:r>
-              <w:rPr>
-                <w:rFonts w:ascii="Calibri" w:hAnsi="Calibri" w:cs="Arial"/>
-                <w:i/>
-                <w:color w:val="548DD4"/>
-                <w:sz w:val="18"/>
-                <w:szCs w:val="20"/>
-                <w:lang w:eastAsia="es-CL"/>
-              </w:rPr>
-              <w:t xml:space="preserve">ñala los ajustes o reformulaciones </w:t>
-            </w:r>
-            <w:r>
-              <w:rPr>
-                <w:rFonts w:ascii="Calibri" w:hAnsi="Calibri" w:cs="Arial"/>
-                <w:i/>
-                <w:color w:val="548DD4"/>
-                <w:sz w:val="18"/>
-                <w:szCs w:val="20"/>
-                <w:lang w:eastAsia="es-CL"/>
-              </w:rPr>
-              <w:t>que has realiza</w:t>
-            </w:r>
-            <w:r>
-              <w:rPr>
-                <w:rFonts w:ascii="Calibri" w:hAnsi="Calibri" w:cs="Arial"/>
-                <w:i/>
-                <w:color w:val="548DD4"/>
-                <w:sz w:val="18"/>
-                <w:szCs w:val="20"/>
-                <w:lang w:eastAsia="es-CL"/>
-              </w:rPr>
-              <w:t xml:space="preserve">do. </w:t>
-            </w:r>
           </w:p>
         </w:tc>
       </w:tr>
@@ -2741,8 +2170,8 @@
               <w:jc w:val="both"/>
               <w:rPr>
                 <w:rFonts w:ascii="Calibri" w:hAnsi="Calibri" w:cs="Arial"/>
-                <w:i/>
-                <w:color w:val="548DD4"/>
+                <w:iCs/>
+                <w:color w:val="4472C4" w:themeColor="accent1"/>
                 <w:sz w:val="20"/>
                 <w:szCs w:val="20"/>
                 <w:lang w:eastAsia="es-CL"/>
@@ -2754,120 +2183,21 @@
                 <w:color w:val="1F3864" w:themeColor="accent1" w:themeShade="80"/>
               </w:rPr>
               <w:lastRenderedPageBreak/>
-              <w:t xml:space="preserve">Actividades ajustadas o eliminadas: </w:t>
-            </w:r>
-            <w:r>
-              <w:rPr>
-                <w:rFonts w:ascii="Calibri" w:hAnsi="Calibri" w:cs="Arial"/>
-                <w:i/>
-                <w:color w:val="548DD4"/>
-                <w:sz w:val="20"/>
-                <w:szCs w:val="20"/>
-                <w:lang w:eastAsia="es-CL"/>
-              </w:rPr>
-              <w:t>Señalar los ajustes</w:t>
-            </w:r>
-            <w:r>
-              <w:rPr>
-                <w:rFonts w:ascii="Calibri" w:hAnsi="Calibri" w:cs="Arial"/>
-                <w:i/>
-                <w:color w:val="548DD4"/>
-                <w:sz w:val="20"/>
-                <w:szCs w:val="20"/>
-                <w:lang w:eastAsia="es-CL"/>
-              </w:rPr>
-              <w:t xml:space="preserve"> que realizaste a tu plan de trabajo o </w:t>
-            </w:r>
-            <w:r>
-              <w:rPr>
-                <w:rFonts w:ascii="Calibri" w:hAnsi="Calibri" w:cs="Arial"/>
-                <w:i/>
-                <w:color w:val="548DD4"/>
-                <w:sz w:val="20"/>
-                <w:szCs w:val="20"/>
-                <w:lang w:eastAsia="es-CL"/>
-              </w:rPr>
-              <w:t>actividades que</w:t>
-            </w:r>
-            <w:r>
-              <w:rPr>
-                <w:rFonts w:ascii="Calibri" w:hAnsi="Calibri" w:cs="Arial"/>
-                <w:i/>
-                <w:color w:val="548DD4"/>
-                <w:sz w:val="20"/>
-                <w:szCs w:val="20"/>
-                <w:lang w:eastAsia="es-CL"/>
-              </w:rPr>
-              <w:t xml:space="preserve"> eliminaste</w:t>
-            </w:r>
-            <w:r>
-              <w:rPr>
-                <w:rFonts w:ascii="Calibri" w:hAnsi="Calibri" w:cs="Arial"/>
-                <w:i/>
-                <w:color w:val="548DD4"/>
-                <w:sz w:val="20"/>
-                <w:szCs w:val="20"/>
-                <w:lang w:eastAsia="es-CL"/>
-              </w:rPr>
-              <w:t xml:space="preserve"> y</w:t>
-            </w:r>
-            <w:r>
-              <w:rPr>
-                <w:rFonts w:ascii="Calibri" w:hAnsi="Calibri" w:cs="Arial"/>
-                <w:i/>
-                <w:color w:val="548DD4"/>
-                <w:sz w:val="20"/>
-                <w:szCs w:val="20"/>
-                <w:lang w:eastAsia="es-CL"/>
-              </w:rPr>
-              <w:t>,</w:t>
-            </w:r>
-            <w:r>
-              <w:rPr>
-                <w:rFonts w:ascii="Calibri" w:hAnsi="Calibri" w:cs="Arial"/>
-                <w:i/>
-                <w:color w:val="548DD4"/>
-                <w:sz w:val="20"/>
-                <w:szCs w:val="20"/>
-                <w:lang w:eastAsia="es-CL"/>
-              </w:rPr>
-              <w:t xml:space="preserve"> justifica por</w:t>
-            </w:r>
-            <w:r>
-              <w:rPr>
-                <w:rFonts w:ascii="Calibri" w:hAnsi="Calibri" w:cs="Arial"/>
-                <w:i/>
-                <w:color w:val="548DD4"/>
-                <w:sz w:val="20"/>
-                <w:szCs w:val="20"/>
-                <w:lang w:eastAsia="es-CL"/>
-              </w:rPr>
-              <w:t xml:space="preserve"> </w:t>
-            </w:r>
-            <w:r>
-              <w:rPr>
-                <w:rFonts w:ascii="Calibri" w:hAnsi="Calibri" w:cs="Arial"/>
-                <w:i/>
-                <w:color w:val="548DD4"/>
-                <w:sz w:val="20"/>
-                <w:szCs w:val="20"/>
-                <w:lang w:eastAsia="es-CL"/>
-              </w:rPr>
-              <w:t xml:space="preserve">qué lo hiciste. </w:t>
-            </w:r>
-            <w:r>
-              <w:t xml:space="preserve"> </w:t>
-            </w:r>
-            <w:r>
-              <w:rPr>
-                <w:rFonts w:ascii="Calibri" w:hAnsi="Calibri" w:cs="Arial"/>
-                <w:i/>
-                <w:color w:val="548DD4"/>
-                <w:sz w:val="20"/>
-                <w:szCs w:val="20"/>
-                <w:lang w:eastAsia="es-CL"/>
-              </w:rPr>
-              <w:t>En el caso de que tu plan de trabajo no haya requerido ni requiera ajustes, justifica esta decisión a partir de los facilitadores que te han permitido desarrollarlo como fue planeado.</w:t>
+              <w:t>Actividades ajustadas o eliminadas</w:t>
+            </w:r>
+            <w:r>
+              <w:rPr>
+                <w:rFonts w:ascii="Calibri" w:hAnsi="Calibri"/>
+                <w:color w:val="4472C4" w:themeColor="accent1"/>
+              </w:rPr>
+              <w:t xml:space="preserve">: </w:t>
+            </w:r>
+            <w:r>
+              <w:rPr>
+                <w:rFonts w:ascii="Calibri" w:hAnsi="Calibri"/>
+                <w:color w:val="4472C4" w:themeColor="accent1"/>
+              </w:rPr>
+              <w:t>El plan de trabajo no ha requerido modificaciones sustanciales en su estructura general, dado que los entregables y la asignación de roles (Gerencia de Proyecto: Cristian Briones; Desarrollo e Integración: Ignacio Gatillon; Desarrollo/QA: Francisco Silva) han operado de acuerdo con lo planificado.</w:t>
             </w:r>
           </w:p>
           <w:p>
@@ -3028,7 +2358,7 @@
                 <w:color w:val="548DD4"/>
                 <w:sz w:val="20"/>
                 <w:szCs w:val="20"/>
-                <w:lang w:eastAsia="es-CL"/>
+                <w:lang w:val="es-ES" w:eastAsia="es-CL"/>
               </w:rPr>
             </w:pPr>
             <w:r>
@@ -3052,151 +2382,51 @@
             <w:r>
               <w:rPr>
                 <w:rFonts w:ascii="Calibri" w:hAnsi="Calibri" w:cs="Arial"/>
-                <w:i/>
-                <w:color w:val="548DD4"/>
-                <w:sz w:val="20"/>
-                <w:szCs w:val="20"/>
-                <w:lang w:eastAsia="es-CL"/>
-              </w:rPr>
-              <w:t>En caso</w:t>
-            </w:r>
-            <w:r>
-              <w:rPr>
-                <w:rFonts w:ascii="Calibri" w:hAnsi="Calibri" w:cs="Arial"/>
-                <w:i/>
-                <w:color w:val="548DD4"/>
-                <w:sz w:val="20"/>
-                <w:szCs w:val="20"/>
-                <w:lang w:eastAsia="es-CL"/>
-              </w:rPr>
-              <w:t xml:space="preserve"> de</w:t>
-            </w:r>
-            <w:r>
-              <w:rPr>
-                <w:rFonts w:ascii="Calibri" w:hAnsi="Calibri" w:cs="Arial"/>
-                <w:i/>
-                <w:color w:val="548DD4"/>
-                <w:sz w:val="20"/>
-                <w:szCs w:val="20"/>
-                <w:lang w:eastAsia="es-CL"/>
-              </w:rPr>
-              <w:t xml:space="preserve"> que </w:t>
-            </w:r>
-            <w:r>
-              <w:rPr>
-                <w:rFonts w:ascii="Calibri" w:hAnsi="Calibri" w:cs="Arial"/>
-                <w:b/>
-                <w:i/>
-                <w:color w:val="548DD4"/>
-                <w:sz w:val="20"/>
-                <w:szCs w:val="20"/>
-                <w:lang w:eastAsia="es-CL"/>
-              </w:rPr>
-              <w:t>no ha</w:t>
-            </w:r>
-            <w:r>
-              <w:rPr>
-                <w:rFonts w:ascii="Calibri" w:hAnsi="Calibri" w:cs="Arial"/>
-                <w:b/>
-                <w:i/>
-                <w:color w:val="548DD4"/>
-                <w:sz w:val="20"/>
-                <w:szCs w:val="20"/>
-                <w:lang w:eastAsia="es-CL"/>
-              </w:rPr>
-              <w:t>yas</w:t>
-            </w:r>
-            <w:r>
-              <w:rPr>
-                <w:rFonts w:ascii="Calibri" w:hAnsi="Calibri" w:cs="Arial"/>
-                <w:b/>
-                <w:i/>
-                <w:color w:val="548DD4"/>
-                <w:sz w:val="20"/>
-                <w:szCs w:val="20"/>
-                <w:lang w:eastAsia="es-CL"/>
-              </w:rPr>
-              <w:t xml:space="preserve"> iniciado actividades o est</w:t>
-            </w:r>
-            <w:r>
-              <w:rPr>
-                <w:rFonts w:ascii="Calibri" w:hAnsi="Calibri" w:cs="Arial"/>
-                <w:b/>
-                <w:i/>
-                <w:color w:val="548DD4"/>
-                <w:sz w:val="20"/>
-                <w:szCs w:val="20"/>
-                <w:lang w:eastAsia="es-CL"/>
-              </w:rPr>
-              <w:t>é</w:t>
-            </w:r>
-            <w:r>
-              <w:rPr>
-                <w:rFonts w:ascii="Calibri" w:hAnsi="Calibri" w:cs="Arial"/>
-                <w:b/>
-                <w:i/>
-                <w:color w:val="548DD4"/>
-                <w:sz w:val="20"/>
-                <w:szCs w:val="20"/>
-                <w:lang w:eastAsia="es-CL"/>
-              </w:rPr>
-              <w:t>n retrasadas</w:t>
-            </w:r>
-            <w:r>
-              <w:rPr>
-                <w:rFonts w:ascii="Calibri" w:hAnsi="Calibri" w:cs="Arial"/>
-                <w:i/>
-                <w:color w:val="548DD4"/>
-                <w:sz w:val="20"/>
-                <w:szCs w:val="20"/>
-                <w:lang w:eastAsia="es-CL"/>
-              </w:rPr>
-              <w:t xml:space="preserve"> de acuerdo a tu planificación</w:t>
-            </w:r>
-            <w:r>
-              <w:rPr>
-                <w:rFonts w:ascii="Calibri" w:hAnsi="Calibri" w:cs="Arial"/>
-                <w:i/>
-                <w:color w:val="548DD4"/>
-                <w:sz w:val="20"/>
-                <w:szCs w:val="20"/>
-                <w:lang w:eastAsia="es-CL"/>
-              </w:rPr>
-              <w:t>,</w:t>
-            </w:r>
-            <w:r>
-              <w:rPr>
-                <w:rFonts w:ascii="Calibri" w:hAnsi="Calibri" w:cs="Arial"/>
-                <w:i/>
-                <w:color w:val="548DD4"/>
-                <w:sz w:val="20"/>
-                <w:szCs w:val="20"/>
-                <w:lang w:eastAsia="es-CL"/>
-              </w:rPr>
-              <w:t xml:space="preserve"> señala los motivos por lo</w:t>
-            </w:r>
-            <w:r>
-              <w:rPr>
-                <w:rFonts w:ascii="Calibri" w:hAnsi="Calibri" w:cs="Arial"/>
-                <w:i/>
-                <w:color w:val="548DD4"/>
-                <w:sz w:val="20"/>
-                <w:szCs w:val="20"/>
-                <w:lang w:eastAsia="es-CL"/>
-              </w:rPr>
-              <w:t>s</w:t>
-            </w:r>
-            <w:r>
-              <w:rPr>
-                <w:rFonts w:ascii="Calibri" w:hAnsi="Calibri" w:cs="Arial"/>
-                <w:i/>
-                <w:color w:val="548DD4"/>
-                <w:sz w:val="20"/>
-                <w:szCs w:val="20"/>
-                <w:lang w:eastAsia="es-CL"/>
-              </w:rPr>
-              <w:t xml:space="preserve"> que no has podido cumplir dichos plazos y qué estrategias utilizarás para avanzar en dichas actividades y no afectar tu proyecto APT. </w:t>
-            </w:r>
+                <w:iCs/>
+                <w:color w:val="548DD4"/>
+                <w:sz w:val="20"/>
+                <w:szCs w:val="20"/>
+                <w:lang w:val="es-ES" w:eastAsia="es-CL"/>
+              </w:rPr>
+              <w:t xml:space="preserve">La fase de pruebas de integración y validación de sincronización offline (RF-03 y RF-04) aún no se inicia formalmente por encontrarse en la etapa de desarrollo de componentes de interfaz y escaneo en el </w:t>
+            </w:r>
+            <w:proofErr w:type="spellStart"/>
+            <w:r>
+              <w:rPr>
+                <w:rFonts w:ascii="Calibri" w:hAnsi="Calibri" w:cs="Arial"/>
+                <w:iCs/>
+                <w:color w:val="548DD4"/>
+                <w:sz w:val="20"/>
+                <w:szCs w:val="20"/>
+                <w:lang w:val="es-ES" w:eastAsia="es-CL"/>
+              </w:rPr>
+              <w:t>frontend</w:t>
+            </w:r>
+            <w:proofErr w:type="spellEnd"/>
+            <w:r>
+              <w:rPr>
+                <w:rFonts w:ascii="Calibri" w:hAnsi="Calibri" w:cs="Arial"/>
+                <w:iCs/>
+                <w:color w:val="548DD4"/>
+                <w:sz w:val="20"/>
+                <w:szCs w:val="20"/>
+                <w:lang w:val="es-ES" w:eastAsia="es-CL"/>
+              </w:rPr>
+              <w:t>. Esto se encuentra dentro de los plazos previstos de la carta Gantt y no representa un retraso que afecte la entrega global del proyecto APT.</w:t>
+            </w:r>
+          </w:p>
+          <w:p>
+            <w:pPr>
+              <w:jc w:val="both"/>
+              <w:rPr>
+                <w:rFonts w:ascii="Calibri" w:hAnsi="Calibri" w:cs="Arial"/>
+                <w:iCs/>
+                <w:color w:val="548DD4"/>
+                <w:sz w:val="20"/>
+                <w:szCs w:val="20"/>
+                <w:lang w:eastAsia="es-CL"/>
+              </w:rPr>
+            </w:pPr>
           </w:p>
           <w:p>
             <w:pPr>
@@ -3311,7 +2541,7 @@
 </file>
 
 <file path=word/endnotes.xml><?xml version="1.0" encoding="utf-8"?>
-<w:endnotes xmlns:wpc="http://schemas.microsoft.com/office/word/2010/wordprocessingCanvas" xmlns:cx="http://schemas.microsoft.com/office/drawing/2014/chartex" xmlns:mc="http://schemas.openxmlformats.org/markup-compatibility/2006" xmlns:o="urn:schemas-microsoft-com:office:office" xmlns:r="http://schemas.openxmlformats.org/officeDocument/2006/relationships" xmlns:m="http://schemas.openxmlformats.org/officeDocument/2006/math" xmlns:v="urn:schemas-microsoft-com:vml" xmlns:wp14="http://schemas.microsoft.com/office/word/2010/wordprocessingDrawing" xmlns:wp="http://schemas.openxmlformats.org/drawingml/2006/wordprocessingDrawing" xmlns:w10="urn:schemas-microsoft-com:office:word" xmlns:w="http://schemas.openxmlformats.org/wordprocessingml/2006/main" xmlns:w14="http://schemas.microsoft.com/office/word/2010/wordml" xmlns:w15="http://schemas.microsoft.com/office/word/2012/wordml" xmlns:w16se="http://schemas.microsoft.com/office/word/2015/wordml/symex" xmlns:wpg="http://schemas.microsoft.com/office/word/2010/wordprocessingGroup" xmlns:wpi="http://schemas.microsoft.com/office/word/2010/wordprocessingInk" xmlns:wne="http://schemas.microsoft.com/office/word/2006/wordml" xmlns:wps="http://schemas.microsoft.com/office/word/2010/wordprocessingShape" mc:Ignorable="w14 w15 w16se wp14">
+<w:endnotes xmlns:wpc="http://schemas.microsoft.com/office/word/2010/wordprocessingCanvas" xmlns:cx="http://schemas.microsoft.com/office/drawing/2014/chartex" xmlns:cx1="http://schemas.microsoft.com/office/drawing/2015/9/8/chartex" xmlns:cx2="http://schemas.microsoft.com/office/drawing/2015/10/21/chartex" xmlns:cx3="http://schemas.microsoft.com/office/drawing/2016/5/9/chartex" xmlns:cx4="http://schemas.microsoft.com/office/drawing/2016/5/10/chartex" xmlns:cx5="http://schemas.microsoft.com/office/drawing/2016/5/11/chartex" xmlns:cx6="http://schemas.microsoft.com/office/drawing/2016/5/12/chartex" xmlns:cx7="http://schemas.microsoft.com/office/drawing/2016/5/13/chartex" xmlns:cx8="http://schemas.microsoft.com/office/drawing/2016/5/14/chartex" xmlns:mc="http://schemas.openxmlformats.org/markup-compatibility/2006" xmlns:aink="http://schemas.microsoft.com/office/drawing/2016/ink" xmlns:am3d="http://schemas.microsoft.com/office/drawing/2017/model3d" xmlns:o="urn:schemas-microsoft-com:office:office" xmlns:oel="http://schemas.microsoft.com/office/2019/extlst" xmlns:r="http://schemas.openxmlformats.org/officeDocument/2006/relationships" xmlns:m="http://schemas.openxmlformats.org/officeDocument/2006/math" xmlns:v="urn:schemas-microsoft-com:vml" xmlns:wp14="http://schemas.microsoft.com/office/word/2010/wordprocessingDrawing" xmlns:wp="http://schemas.openxmlformats.org/drawingml/2006/wordprocessingDrawing" xmlns:w10="urn:schemas-microsoft-com:office:word" xmlns:w="http://schemas.openxmlformats.org/wordprocessingml/2006/main" xmlns:w14="http://schemas.microsoft.com/office/word/2010/wordml" xmlns:w15="http://schemas.microsoft.com/office/word/2012/wordml" xmlns:w16cex="http://schemas.microsoft.com/office/word/2018/wordml/cex" xmlns:w16cid="http://schemas.microsoft.com/office/word/2016/wordml/cid" xmlns:w16="http://schemas.microsoft.com/office/word/2018/wordml" xmlns:w16du="http://schemas.microsoft.com/office/word/2023/wordml/word16du" xmlns:w16sdtdh="http://schemas.microsoft.com/office/word/2020/wordml/sdtdatahash" xmlns:w16sdtfl="http://schemas.microsoft.com/office/word/2024/wordml/sdtformatlock" xmlns:w16se="http://schemas.microsoft.com/office/word/2015/wordml/symex" xmlns:wpg="http://schemas.microsoft.com/office/word/2010/wordprocessingGroup" xmlns:wpi="http://schemas.microsoft.com/office/word/2010/wordprocessingInk" xmlns:wne="http://schemas.microsoft.com/office/word/2006/wordml" xmlns:wps="http://schemas.microsoft.com/office/word/2010/wordprocessingShape" mc:Ignorable="w14 w15 w16se w16cid w16 w16cex w16sdtdh w16sdtfl w16du wp14">
   <w:endnote w:type="separator" w:id="-1">
     <w:p>
       <w:pPr>
@@ -3336,7 +2566,7 @@
 </file>
 
 <file path=word/footnotes.xml><?xml version="1.0" encoding="utf-8"?>
-<w:footnotes xmlns:wpc="http://schemas.microsoft.com/office/word/2010/wordprocessingCanvas" xmlns:cx="http://schemas.microsoft.com/office/drawing/2014/chartex" xmlns:mc="http://schemas.openxmlformats.org/markup-compatibility/2006" xmlns:o="urn:schemas-microsoft-com:office:office" xmlns:r="http://schemas.openxmlformats.org/officeDocument/2006/relationships" xmlns:m="http://schemas.openxmlformats.org/officeDocument/2006/math" xmlns:v="urn:schemas-microsoft-com:vml" xmlns:wp14="http://schemas.microsoft.com/office/word/2010/wordprocessingDrawing" xmlns:wp="http://schemas.openxmlformats.org/drawingml/2006/wordprocessingDrawing" xmlns:w10="urn:schemas-microsoft-com:office:word" xmlns:w="http://schemas.openxmlformats.org/wordprocessingml/2006/main" xmlns:w14="http://schemas.microsoft.com/office/word/2010/wordml" xmlns:w15="http://schemas.microsoft.com/office/word/2012/wordml" xmlns:w16se="http://schemas.microsoft.com/office/word/2015/wordml/symex" xmlns:wpg="http://schemas.microsoft.com/office/word/2010/wordprocessingGroup" xmlns:wpi="http://schemas.microsoft.com/office/word/2010/wordprocessingInk" xmlns:wne="http://schemas.microsoft.com/office/word/2006/wordml" xmlns:wps="http://schemas.microsoft.com/office/word/2010/wordprocessingShape" mc:Ignorable="w14 w15 w16se wp14">
+<w:footnotes xmlns:wpc="http://schemas.microsoft.com/office/word/2010/wordprocessingCanvas" xmlns:cx="http://schemas.microsoft.com/office/drawing/2014/chartex" xmlns:cx1="http://schemas.microsoft.com/office/drawing/2015/9/8/chartex" xmlns:cx2="http://schemas.microsoft.com/office/drawing/2015/10/21/chartex" xmlns:cx3="http://schemas.microsoft.com/office/drawing/2016/5/9/chartex" xmlns:cx4="http://schemas.microsoft.com/office/drawing/2016/5/10/chartex" xmlns:cx5="http://schemas.microsoft.com/office/drawing/2016/5/11/chartex" xmlns:cx6="http://schemas.microsoft.com/office/drawing/2016/5/12/chartex" xmlns:cx7="http://schemas.microsoft.com/office/drawing/2016/5/13/chartex" xmlns:cx8="http://schemas.microsoft.com/office/drawing/2016/5/14/chartex" xmlns:mc="http://schemas.openxmlformats.org/markup-compatibility/2006" xmlns:aink="http://schemas.microsoft.com/office/drawing/2016/ink" xmlns:am3d="http://schemas.microsoft.com/office/drawing/2017/model3d" xmlns:o="urn:schemas-microsoft-com:office:office" xmlns:oel="http://schemas.microsoft.com/office/2019/extlst" xmlns:r="http://schemas.openxmlformats.org/officeDocument/2006/relationships" xmlns:m="http://schemas.openxmlformats.org/officeDocument/2006/math" xmlns:v="urn:schemas-microsoft-com:vml" xmlns:wp14="http://schemas.microsoft.com/office/word/2010/wordprocessingDrawing" xmlns:wp="http://schemas.openxmlformats.org/drawingml/2006/wordprocessingDrawing" xmlns:w10="urn:schemas-microsoft-com:office:word" xmlns:w="http://schemas.openxmlformats.org/wordprocessingml/2006/main" xmlns:w14="http://schemas.microsoft.com/office/word/2010/wordml" xmlns:w15="http://schemas.microsoft.com/office/word/2012/wordml" xmlns:w16cex="http://schemas.microsoft.com/office/word/2018/wordml/cex" xmlns:w16cid="http://schemas.microsoft.com/office/word/2016/wordml/cid" xmlns:w16="http://schemas.microsoft.com/office/word/2018/wordml" xmlns:w16du="http://schemas.microsoft.com/office/word/2023/wordml/word16du" xmlns:w16sdtdh="http://schemas.microsoft.com/office/word/2020/wordml/sdtdatahash" xmlns:w16sdtfl="http://schemas.microsoft.com/office/word/2024/wordml/sdtformatlock" xmlns:w16se="http://schemas.microsoft.com/office/word/2015/wordml/symex" xmlns:wpg="http://schemas.microsoft.com/office/word/2010/wordprocessingGroup" xmlns:wpi="http://schemas.microsoft.com/office/word/2010/wordprocessingInk" xmlns:wne="http://schemas.microsoft.com/office/word/2006/wordml" xmlns:wps="http://schemas.microsoft.com/office/word/2010/wordprocessingShape" mc:Ignorable="w14 w15 w16se w16cid w16 w16cex w16sdtdh w16sdtfl w16du wp14">
   <w:footnote w:type="separator" w:id="-1">
     <w:p>
       <w:pPr>
@@ -3419,7 +2649,7 @@
 </file>
 
 <file path=word/header1.xml><?xml version="1.0" encoding="utf-8"?>
-<w:hdr xmlns:wpc="http://schemas.microsoft.com/office/word/2010/wordprocessingCanvas" xmlns:cx="http://schemas.microsoft.com/office/drawing/2014/chartex" xmlns:mc="http://schemas.openxmlformats.org/markup-compatibility/2006" xmlns:o="urn:schemas-microsoft-com:office:office" xmlns:r="http://schemas.openxmlformats.org/officeDocument/2006/relationships" xmlns:m="http://schemas.openxmlformats.org/officeDocument/2006/math" xmlns:v="urn:schemas-microsoft-com:vml" xmlns:wp14="http://schemas.microsoft.com/office/word/2010/wordprocessingDrawing" xmlns:wp="http://schemas.openxmlformats.org/drawingml/2006/wordprocessingDrawing" xmlns:w10="urn:schemas-microsoft-com:office:word" xmlns:w="http://schemas.openxmlformats.org/wordprocessingml/2006/main" xmlns:w14="http://schemas.microsoft.com/office/word/2010/wordml" xmlns:w15="http://schemas.microsoft.com/office/word/2012/wordml" xmlns:w16se="http://schemas.microsoft.com/office/word/2015/wordml/symex" xmlns:wpg="http://schemas.microsoft.com/office/word/2010/wordprocessingGroup" xmlns:wpi="http://schemas.microsoft.com/office/word/2010/wordprocessingInk" xmlns:wne="http://schemas.microsoft.com/office/word/2006/wordml" xmlns:wps="http://schemas.microsoft.com/office/word/2010/wordprocessingShape" mc:Ignorable="w14 w15 w16se wp14">
+<w:hdr xmlns:wpc="http://schemas.microsoft.com/office/word/2010/wordprocessingCanvas" xmlns:cx="http://schemas.microsoft.com/office/drawing/2014/chartex" xmlns:cx1="http://schemas.microsoft.com/office/drawing/2015/9/8/chartex" xmlns:cx2="http://schemas.microsoft.com/office/drawing/2015/10/21/chartex" xmlns:cx3="http://schemas.microsoft.com/office/drawing/2016/5/9/chartex" xmlns:cx4="http://schemas.microsoft.com/office/drawing/2016/5/10/chartex" xmlns:cx5="http://schemas.microsoft.com/office/drawing/2016/5/11/chartex" xmlns:cx6="http://schemas.microsoft.com/office/drawing/2016/5/12/chartex" xmlns:cx7="http://schemas.microsoft.com/office/drawing/2016/5/13/chartex" xmlns:cx8="http://schemas.microsoft.com/office/drawing/2016/5/14/chartex" xmlns:mc="http://schemas.openxmlformats.org/markup-compatibility/2006" xmlns:aink="http://schemas.microsoft.com/office/drawing/2016/ink" xmlns:am3d="http://schemas.microsoft.com/office/drawing/2017/model3d" xmlns:o="urn:schemas-microsoft-com:office:office" xmlns:oel="http://schemas.microsoft.com/office/2019/extlst" xmlns:r="http://schemas.openxmlformats.org/officeDocument/2006/relationships" xmlns:m="http://schemas.openxmlformats.org/officeDocument/2006/math" xmlns:v="urn:schemas-microsoft-com:vml" xmlns:wp14="http://schemas.microsoft.com/office/word/2010/wordprocessingDrawing" xmlns:wp="http://schemas.openxmlformats.org/drawingml/2006/wordprocessingDrawing" xmlns:w10="urn:schemas-microsoft-com:office:word" xmlns:w="http://schemas.openxmlformats.org/wordprocessingml/2006/main" xmlns:w14="http://schemas.microsoft.com/office/word/2010/wordml" xmlns:w15="http://schemas.microsoft.com/office/word/2012/wordml" xmlns:w16cex="http://schemas.microsoft.com/office/word/2018/wordml/cex" xmlns:w16cid="http://schemas.microsoft.com/office/word/2016/wordml/cid" xmlns:w16="http://schemas.microsoft.com/office/word/2018/wordml" xmlns:w16du="http://schemas.microsoft.com/office/word/2023/wordml/word16du" xmlns:w16sdtdh="http://schemas.microsoft.com/office/word/2020/wordml/sdtdatahash" xmlns:w16sdtfl="http://schemas.microsoft.com/office/word/2024/wordml/sdtformatlock" xmlns:w16se="http://schemas.microsoft.com/office/word/2015/wordml/symex" xmlns:wpg="http://schemas.microsoft.com/office/word/2010/wordprocessingGroup" xmlns:wpi="http://schemas.microsoft.com/office/word/2010/wordprocessingInk" xmlns:wne="http://schemas.microsoft.com/office/word/2006/wordml" xmlns:wps="http://schemas.microsoft.com/office/word/2010/wordprocessingShape" mc:Ignorable="w14 w15 w16se w16cid w16 w16cex w16sdtdh w16sdtfl w16du wp14">
   <w:tbl>
     <w:tblPr>
       <w:tblStyle w:val="Tablaconcuadrcula1"/>
@@ -3644,7 +2874,7 @@
 </file>
 
 <file path=word/numbering.xml><?xml version="1.0" encoding="utf-8"?>
-<w:numbering xmlns:wpc="http://schemas.microsoft.com/office/word/2010/wordprocessingCanvas" xmlns:cx="http://schemas.microsoft.com/office/drawing/2014/chartex" xmlns:mc="http://schemas.openxmlformats.org/markup-compatibility/2006" xmlns:o="urn:schemas-microsoft-com:office:office" xmlns:r="http://schemas.openxmlformats.org/officeDocument/2006/relationships" xmlns:m="http://schemas.openxmlformats.org/officeDocument/2006/math" xmlns:v="urn:schemas-microsoft-com:vml" xmlns:wp14="http://schemas.microsoft.com/office/word/2010/wordprocessingDrawing" xmlns:wp="http://schemas.openxmlformats.org/drawingml/2006/wordprocessingDrawing" xmlns:w10="urn:schemas-microsoft-com:office:word" xmlns:w="http://schemas.openxmlformats.org/wordprocessingml/2006/main" xmlns:w14="http://schemas.microsoft.com/office/word/2010/wordml" xmlns:w15="http://schemas.microsoft.com/office/word/2012/wordml" xmlns:w16se="http://schemas.microsoft.com/office/word/2015/wordml/symex" xmlns:wpg="http://schemas.microsoft.com/office/word/2010/wordprocessingGroup" xmlns:wpi="http://schemas.microsoft.com/office/word/2010/wordprocessingInk" xmlns:wne="http://schemas.microsoft.com/office/word/2006/wordml" xmlns:wps="http://schemas.microsoft.com/office/word/2010/wordprocessingShape" mc:Ignorable="w14 w15 w16se wp14">
+<w:numbering xmlns:wpc="http://schemas.microsoft.com/office/word/2010/wordprocessingCanvas" xmlns:cx="http://schemas.microsoft.com/office/drawing/2014/chartex" xmlns:cx1="http://schemas.microsoft.com/office/drawing/2015/9/8/chartex" xmlns:cx2="http://schemas.microsoft.com/office/drawing/2015/10/21/chartex" xmlns:cx3="http://schemas.microsoft.com/office/drawing/2016/5/9/chartex" xmlns:cx4="http://schemas.microsoft.com/office/drawing/2016/5/10/chartex" xmlns:cx5="http://schemas.microsoft.com/office/drawing/2016/5/11/chartex" xmlns:cx6="http://schemas.microsoft.com/office/drawing/2016/5/12/chartex" xmlns:cx7="http://schemas.microsoft.com/office/drawing/2016/5/13/chartex" xmlns:cx8="http://schemas.microsoft.com/office/drawing/2016/5/14/chartex" xmlns:mc="http://schemas.openxmlformats.org/markup-compatibility/2006" xmlns:aink="http://schemas.microsoft.com/office/drawing/2016/ink" xmlns:am3d="http://schemas.microsoft.com/office/drawing/2017/model3d" xmlns:o="urn:schemas-microsoft-com:office:office" xmlns:oel="http://schemas.microsoft.com/office/2019/extlst" xmlns:r="http://schemas.openxmlformats.org/officeDocument/2006/relationships" xmlns:m="http://schemas.openxmlformats.org/officeDocument/2006/math" xmlns:v="urn:schemas-microsoft-com:vml" xmlns:wp14="http://schemas.microsoft.com/office/word/2010/wordprocessingDrawing" xmlns:wp="http://schemas.openxmlformats.org/drawingml/2006/wordprocessingDrawing" xmlns:w10="urn:schemas-microsoft-com:office:word" xmlns:w="http://schemas.openxmlformats.org/wordprocessingml/2006/main" xmlns:w14="http://schemas.microsoft.com/office/word/2010/wordml" xmlns:w15="http://schemas.microsoft.com/office/word/2012/wordml" xmlns:w16cex="http://schemas.microsoft.com/office/word/2018/wordml/cex" xmlns:w16cid="http://schemas.microsoft.com/office/word/2016/wordml/cid" xmlns:w16="http://schemas.microsoft.com/office/word/2018/wordml" xmlns:w16du="http://schemas.microsoft.com/office/word/2023/wordml/word16du" xmlns:w16sdtdh="http://schemas.microsoft.com/office/word/2020/wordml/sdtdatahash" xmlns:w16sdtfl="http://schemas.microsoft.com/office/word/2024/wordml/sdtformatlock" xmlns:w16se="http://schemas.microsoft.com/office/word/2015/wordml/symex" xmlns:wpg="http://schemas.microsoft.com/office/word/2010/wordprocessingGroup" xmlns:wpi="http://schemas.microsoft.com/office/word/2010/wordprocessingInk" xmlns:wne="http://schemas.microsoft.com/office/word/2006/wordml" xmlns:wps="http://schemas.microsoft.com/office/word/2010/wordprocessingShape" mc:Ignorable="w14 w15 w16se w16cid w16 w16cex w16sdtdh w16sdtfl w16du wp14">
   <w:abstractNum w:abstractNumId="0" w15:restartNumberingAfterBreak="0">
     <w:nsid w:val="2FFD4C7F"/>
     <w:multiLevelType w:val="multilevel"/>
@@ -3766,14 +2996,192 @@
       </w:rPr>
     </w:lvl>
   </w:abstractNum>
-  <w:num w:numId="1">
+  <w:abstractNum w:abstractNumId="1" w15:restartNumberingAfterBreak="0">
+    <w:nsid w:val="71CE4672"/>
+    <w:multiLevelType w:val="multilevel"/>
+    <w:tmpl w:val="98382050"/>
+    <w:lvl w:ilvl="0">
+      <w:start w:val="1"/>
+      <w:numFmt w:val="bullet"/>
+      <w:lvlText w:val=""/>
+      <w:lvlJc w:val="left"/>
+      <w:pPr>
+        <w:tabs>
+          <w:tab w:val="num" w:pos="720"/>
+        </w:tabs>
+        <w:ind w:left="720" w:hanging="360"/>
+      </w:pPr>
+      <w:rPr>
+        <w:rFonts w:ascii="Symbol" w:hAnsi="Symbol" w:hint="default"/>
+        <w:sz w:val="20"/>
+      </w:rPr>
+    </w:lvl>
+    <w:lvl w:ilvl="1">
+      <w:start w:val="1"/>
+      <w:numFmt w:val="decimal"/>
+      <w:lvlText w:val="%2."/>
+      <w:lvlJc w:val="left"/>
+      <w:pPr>
+        <w:tabs>
+          <w:tab w:val="num" w:pos="1440"/>
+        </w:tabs>
+        <w:ind w:left="1440" w:hanging="360"/>
+      </w:pPr>
+    </w:lvl>
+    <w:lvl w:ilvl="2" w:tentative="1">
+      <w:start w:val="1"/>
+      <w:numFmt w:val="bullet"/>
+      <w:lvlText w:val=""/>
+      <w:lvlJc w:val="left"/>
+      <w:pPr>
+        <w:tabs>
+          <w:tab w:val="num" w:pos="2160"/>
+        </w:tabs>
+        <w:ind w:left="2160" w:hanging="360"/>
+      </w:pPr>
+      <w:rPr>
+        <w:rFonts w:ascii="Wingdings" w:hAnsi="Wingdings" w:hint="default"/>
+        <w:sz w:val="20"/>
+      </w:rPr>
+    </w:lvl>
+    <w:lvl w:ilvl="3" w:tentative="1">
+      <w:start w:val="1"/>
+      <w:numFmt w:val="bullet"/>
+      <w:lvlText w:val=""/>
+      <w:lvlJc w:val="left"/>
+      <w:pPr>
+        <w:tabs>
+          <w:tab w:val="num" w:pos="2880"/>
+        </w:tabs>
+        <w:ind w:left="2880" w:hanging="360"/>
+      </w:pPr>
+      <w:rPr>
+        <w:rFonts w:ascii="Wingdings" w:hAnsi="Wingdings" w:hint="default"/>
+        <w:sz w:val="20"/>
+      </w:rPr>
+    </w:lvl>
+    <w:lvl w:ilvl="4" w:tentative="1">
+      <w:start w:val="1"/>
+      <w:numFmt w:val="bullet"/>
+      <w:lvlText w:val=""/>
+      <w:lvlJc w:val="left"/>
+      <w:pPr>
+        <w:tabs>
+          <w:tab w:val="num" w:pos="3600"/>
+        </w:tabs>
+        <w:ind w:left="3600" w:hanging="360"/>
+      </w:pPr>
+      <w:rPr>
+        <w:rFonts w:ascii="Wingdings" w:hAnsi="Wingdings" w:hint="default"/>
+        <w:sz w:val="20"/>
+      </w:rPr>
+    </w:lvl>
+    <w:lvl w:ilvl="5" w:tentative="1">
+      <w:start w:val="1"/>
+      <w:numFmt w:val="bullet"/>
+      <w:lvlText w:val=""/>
+      <w:lvlJc w:val="left"/>
+      <w:pPr>
+        <w:tabs>
+          <w:tab w:val="num" w:pos="4320"/>
+        </w:tabs>
+        <w:ind w:left="4320" w:hanging="360"/>
+      </w:pPr>
+      <w:rPr>
+        <w:rFonts w:ascii="Wingdings" w:hAnsi="Wingdings" w:hint="default"/>
+        <w:sz w:val="20"/>
+      </w:rPr>
+    </w:lvl>
+    <w:lvl w:ilvl="6" w:tentative="1">
+      <w:start w:val="1"/>
+      <w:numFmt w:val="bullet"/>
+      <w:lvlText w:val=""/>
+      <w:lvlJc w:val="left"/>
+      <w:pPr>
+        <w:tabs>
+          <w:tab w:val="num" w:pos="5040"/>
+        </w:tabs>
+        <w:ind w:left="5040" w:hanging="360"/>
+      </w:pPr>
+      <w:rPr>
+        <w:rFonts w:ascii="Wingdings" w:hAnsi="Wingdings" w:hint="default"/>
+        <w:sz w:val="20"/>
+      </w:rPr>
+    </w:lvl>
+    <w:lvl w:ilvl="7" w:tentative="1">
+      <w:start w:val="1"/>
+      <w:numFmt w:val="bullet"/>
+      <w:lvlText w:val=""/>
+      <w:lvlJc w:val="left"/>
+      <w:pPr>
+        <w:tabs>
+          <w:tab w:val="num" w:pos="5760"/>
+        </w:tabs>
+        <w:ind w:left="5760" w:hanging="360"/>
+      </w:pPr>
+      <w:rPr>
+        <w:rFonts w:ascii="Wingdings" w:hAnsi="Wingdings" w:hint="default"/>
+        <w:sz w:val="20"/>
+      </w:rPr>
+    </w:lvl>
+    <w:lvl w:ilvl="8" w:tentative="1">
+      <w:start w:val="1"/>
+      <w:numFmt w:val="bullet"/>
+      <w:lvlText w:val=""/>
+      <w:lvlJc w:val="left"/>
+      <w:pPr>
+        <w:tabs>
+          <w:tab w:val="num" w:pos="6480"/>
+        </w:tabs>
+        <w:ind w:left="6480" w:hanging="360"/>
+      </w:pPr>
+      <w:rPr>
+        <w:rFonts w:ascii="Wingdings" w:hAnsi="Wingdings" w:hint="default"/>
+        <w:sz w:val="20"/>
+      </w:rPr>
+    </w:lvl>
+  </w:abstractNum>
+  <w:num w:numId="1" w16cid:durableId="647635867">
     <w:abstractNumId w:val="0"/>
+  </w:num>
+  <w:num w:numId="2" w16cid:durableId="13844800">
+    <w:abstractNumId w:val="1"/>
+  </w:num>
+  <w:num w:numId="3" w16cid:durableId="2039355002">
+    <w:abstractNumId w:val="1"/>
+    <w:lvlOverride w:ilvl="1">
+      <w:lvl w:ilvl="1">
+        <w:numFmt w:val="lowerLetter"/>
+        <w:lvlText w:val="%2."/>
+        <w:lvlJc w:val="left"/>
+      </w:lvl>
+    </w:lvlOverride>
+  </w:num>
+  <w:num w:numId="4" w16cid:durableId="835264123">
+    <w:abstractNumId w:val="1"/>
+    <w:lvlOverride w:ilvl="1">
+      <w:lvl w:ilvl="1">
+        <w:numFmt w:val="lowerLetter"/>
+        <w:lvlText w:val="%2."/>
+        <w:lvlJc w:val="left"/>
+      </w:lvl>
+    </w:lvlOverride>
+  </w:num>
+  <w:num w:numId="5" w16cid:durableId="2061435988">
+    <w:abstractNumId w:val="1"/>
+    <w:lvlOverride w:ilvl="1">
+      <w:lvl w:ilvl="1">
+        <w:numFmt w:val="lowerLetter"/>
+        <w:lvlText w:val="%2."/>
+        <w:lvlJc w:val="left"/>
+      </w:lvl>
+    </w:lvlOverride>
   </w:num>
 </w:numbering>
 </file>
 
 <file path=word/styles.xml><?xml version="1.0" encoding="utf-8"?>
-<w:styles xmlns:mc="http://schemas.openxmlformats.org/markup-compatibility/2006" xmlns:r="http://schemas.openxmlformats.org/officeDocument/2006/relationships" xmlns:w="http://schemas.openxmlformats.org/wordprocessingml/2006/main" xmlns:w14="http://schemas.microsoft.com/office/word/2010/wordml" xmlns:w15="http://schemas.microsoft.com/office/word/2012/wordml" xmlns:w16se="http://schemas.microsoft.com/office/word/2015/wordml/symex" mc:Ignorable="w14 w15 w16se">
+<w:styles xmlns:mc="http://schemas.openxmlformats.org/markup-compatibility/2006" xmlns:r="http://schemas.openxmlformats.org/officeDocument/2006/relationships" xmlns:w="http://schemas.openxmlformats.org/wordprocessingml/2006/main" xmlns:w14="http://schemas.microsoft.com/office/word/2010/wordml" xmlns:w15="http://schemas.microsoft.com/office/word/2012/wordml" xmlns:w16cex="http://schemas.microsoft.com/office/word/2018/wordml/cex" xmlns:w16cid="http://schemas.microsoft.com/office/word/2016/wordml/cid" xmlns:w16="http://schemas.microsoft.com/office/word/2018/wordml" xmlns:w16du="http://schemas.microsoft.com/office/word/2023/wordml/word16du" xmlns:w16sdtdh="http://schemas.microsoft.com/office/word/2020/wordml/sdtdatahash" xmlns:w16sdtfl="http://schemas.microsoft.com/office/word/2024/wordml/sdtformatlock" xmlns:w16se="http://schemas.microsoft.com/office/word/2015/wordml/symex" mc:Ignorable="w14 w15 w16se w16cid w16 w16cex w16sdtdh w16sdtfl w16du">
   <w:docDefaults>
     <w:rPrDefault>
       <w:rPr>
@@ -3785,7 +3193,7 @@
     </w:rPrDefault>
     <w:pPrDefault/>
   </w:docDefaults>
-  <w:latentStyles w:defLockedState="0" w:defUIPriority="99" w:defSemiHidden="0" w:defUnhideWhenUsed="0" w:defQFormat="0" w:count="371">
+  <w:latentStyles w:defLockedState="0" w:defUIPriority="99" w:defSemiHidden="0" w:defUnhideWhenUsed="0" w:defQFormat="0" w:count="376">
     <w:lsdException w:name="Normal" w:uiPriority="0" w:qFormat="1"/>
     <w:lsdException w:name="heading 1" w:uiPriority="9" w:qFormat="1"/>
     <w:lsdException w:name="heading 2" w:semiHidden="1" w:uiPriority="9" w:unhideWhenUsed="1" w:qFormat="1"/>
@@ -4157,6 +3565,11 @@
     <w:lsdException w:name="List Table 5 Dark Accent 6" w:uiPriority="50"/>
     <w:lsdException w:name="List Table 6 Colorful Accent 6" w:uiPriority="51"/>
     <w:lsdException w:name="List Table 7 Colorful Accent 6" w:uiPriority="52"/>
+    <w:lsdException w:name="Mention" w:semiHidden="1" w:unhideWhenUsed="1"/>
+    <w:lsdException w:name="Smart Hyperlink" w:semiHidden="1" w:unhideWhenUsed="1"/>
+    <w:lsdException w:name="Hashtag" w:semiHidden="1" w:unhideWhenUsed="1"/>
+    <w:lsdException w:name="Unresolved Mention" w:semiHidden="1" w:unhideWhenUsed="1"/>
+    <w:lsdException w:name="Smart Link" w:semiHidden="1" w:unhideWhenUsed="1"/>
   </w:latentStyles>
   <w:style w:type="paragraph" w:default="1" w:styleId="Normal">
     <w:name w:val="Normal"/>
@@ -4195,7 +3608,6 @@
   <w:style w:type="character" w:default="1" w:styleId="Fuentedeprrafopredeter">
     <w:name w:val="Default Paragraph Font"/>
     <w:uiPriority w:val="1"/>
-    <w:semiHidden/>
     <w:unhideWhenUsed/>
   </w:style>
   <w:style w:type="table" w:default="1" w:styleId="Tablanormal">
@@ -4458,6 +3870,19 @@
       <w:bCs/>
       <w:sz w:val="20"/>
       <w:szCs w:val="20"/>
+    </w:rPr>
+  </w:style>
+  <w:style w:type="paragraph" w:styleId="NormalWeb">
+    <w:name w:val="Normal (Web)"/>
+    <w:basedOn w:val="Normal"/>
+    <w:uiPriority w:val="99"/>
+    <w:semiHidden/>
+    <w:unhideWhenUsed/>
+    <w:rsid w:val="00286FF9"/>
+    <w:rPr>
+      <w:rFonts w:ascii="Times New Roman" w:hAnsi="Times New Roman" w:cs="Times New Roman"/>
+      <w:sz w:val="24"/>
+      <w:szCs w:val="24"/>
     </w:rPr>
   </w:style>
 </w:styles>
@@ -4759,12 +4184,6 @@
 </file>
 
 <file path=customXml/item1.xml><?xml version="1.0" encoding="utf-8"?>
-<p:properties xmlns:p="http://schemas.microsoft.com/office/2006/metadata/properties" xmlns:xsi="http://www.w3.org/2001/XMLSchema-instance" xmlns:pc="http://schemas.microsoft.com/office/infopath/2007/PartnerControls">
-  <documentManagement/>
-</p:properties>
-</file>
-
-<file path=customXml/item2.xml><?xml version="1.0" encoding="utf-8"?>
 <ct:contentTypeSchema xmlns:ct="http://schemas.microsoft.com/office/2006/metadata/contentType" xmlns:ma="http://schemas.microsoft.com/office/2006/metadata/properties/metaAttributes" ct:_="" ma:_="" ma:contentTypeName="Documento" ma:contentTypeID="0x010100E96778489EE7714D8BD12CC105EB918B" ma:contentTypeVersion="2" ma:contentTypeDescription="Crear nuevo documento." ma:contentTypeScope="" ma:versionID="416c5c7ae9b5d54d83875cd3c65194e3">
   <xsd:schema xmlns:xsd="http://www.w3.org/2001/XMLSchema" xmlns:xs="http://www.w3.org/2001/XMLSchema" xmlns:p="http://schemas.microsoft.com/office/2006/metadata/properties" xmlns:ns2="126e8a1c-9ea9-435a-ac89-d06c80d62e30" targetNamespace="http://schemas.microsoft.com/office/2006/metadata/properties" ma:root="true" ma:fieldsID="70a237c842677bd850644f8595079f5e" ns2:_="">
     <xsd:import namespace="126e8a1c-9ea9-435a-ac89-d06c80d62e30"/>
@@ -4896,6 +4315,12 @@
 </ct:contentTypeSchema>
 </file>
 
+<file path=customXml/item2.xml><?xml version="1.0" encoding="utf-8"?>
+<p:properties xmlns:p="http://schemas.microsoft.com/office/2006/metadata/properties" xmlns:xsi="http://www.w3.org/2001/XMLSchema-instance" xmlns:pc="http://schemas.microsoft.com/office/infopath/2007/PartnerControls">
+  <documentManagement/>
+</p:properties>
+</file>
+
 <file path=customXml/item3.xml><?xml version="1.0" encoding="utf-8"?>
 <?mso-contentType ?>
 <FormTemplates xmlns="http://schemas.microsoft.com/sharepoint/v3/contenttype/forms">
@@ -4906,22 +4331,6 @@
 </file>
 
 <file path=customXml/itemProps1.xml><?xml version="1.0" encoding="utf-8"?>
-<ds:datastoreItem xmlns:ds="http://schemas.openxmlformats.org/officeDocument/2006/customXml" ds:itemID="{46CA5683-AF87-4E40-B841-2E23A3B52406}">
-  <ds:schemaRefs>
-    <ds:schemaRef ds:uri="http://purl.org/dc/terms/"/>
-    <ds:schemaRef ds:uri="http://purl.org/dc/elements/1.1/"/>
-    <ds:schemaRef ds:uri="http://schemas.openxmlformats.org/package/2006/metadata/core-properties"/>
-    <ds:schemaRef ds:uri="http://www.w3.org/XML/1998/namespace"/>
-    <ds:schemaRef ds:uri="http://schemas.microsoft.com/office/2006/metadata/properties"/>
-    <ds:schemaRef ds:uri="http://schemas.microsoft.com/office/2006/documentManagement/types"/>
-    <ds:schemaRef ds:uri="http://purl.org/dc/dcmitype/"/>
-    <ds:schemaRef ds:uri="http://schemas.microsoft.com/office/infopath/2007/PartnerControls"/>
-    <ds:schemaRef ds:uri="126e8a1c-9ea9-435a-ac89-d06c80d62e30"/>
-  </ds:schemaRefs>
-</ds:datastoreItem>
-</file>
-
-<file path=customXml/itemProps2.xml><?xml version="1.0" encoding="utf-8"?>
 <ds:datastoreItem xmlns:ds="http://schemas.openxmlformats.org/officeDocument/2006/customXml" ds:itemID="{6F3661B0-5934-4FAB-ADC6-33A19B814E8D}">
   <ds:schemaRefs>
     <ds:schemaRef ds:uri="http://schemas.microsoft.com/office/2006/metadata/contentType"/>
@@ -4939,6 +4348,15 @@
 </ds:datastoreItem>
 </file>
 
+<file path=customXml/itemProps2.xml><?xml version="1.0" encoding="utf-8"?>
+<ds:datastoreItem xmlns:ds="http://schemas.openxmlformats.org/officeDocument/2006/customXml" ds:itemID="{46CA5683-AF87-4E40-B841-2E23A3B52406}">
+  <ds:schemaRefs>
+    <ds:schemaRef ds:uri="http://schemas.microsoft.com/office/2006/metadata/properties"/>
+    <ds:schemaRef ds:uri="http://schemas.microsoft.com/office/infopath/2007/PartnerControls"/>
+  </ds:schemaRefs>
+</ds:datastoreItem>
+</file>
+
 <file path=customXml/itemProps3.xml><?xml version="1.0" encoding="utf-8"?>
 <ds:datastoreItem xmlns:ds="http://schemas.openxmlformats.org/officeDocument/2006/customXml" ds:itemID="{D51C61E4-DB75-4684-AD25-71F546404E96}">
   <ds:schemaRefs>

</xml_diff>